<commit_message>
Integrate five supporting journal references into lifecycle paper
Cite Asamoah et al. (2021), Bimha et al. (2019), Namisango et al. (2017),
Kouvelis et al. (2023), and Singh et al. (2026) in the introduction,
mixed methods, ethics, and synthesis sections; body kept to six pages.

Co-Authored-By: Claude Opus 5.5 <noreply@anthropic.com>
Claude-Session: https://claude.ai/code/session_01XnYwi52cCfyVyiDXeuekrB
</commit_message>
<xml_diff>
--- a/Research_Lifecycle_Three_Dissertations.docx
+++ b/Research_Lifecycle_Three_Dissertations.docx
@@ -105,7 +105,7 @@
           <w:b w:val="0"/>
           <w:i w:val="0"/>
         </w:rPr>
-        <w:t xml:space="preserve">The research lifecycle runs from identifying a problem through design, data collection, analysis, interpretation, and dissemination, with ethical obligations carried through every stage. This paper reviews three dissertations that address supply chain disruption and resilience, a topic directly related to my proposed study, </w:t>
+        <w:t xml:space="preserve">The research lifecycle runs from identifying a problem through design, data collection, analysis, interpretation, and dissemination, with ethical obligations carried through every stage. Material shortage is a recurring problem across very different supply chains, from engineered project supply chains (Kouvelis et al., 2023) to humanitarian relief networks (Singh et al., 2026), and it is the focus of my proposed study, </w:t>
       </w:r>
       <w:r>
         <w:rPr>
@@ -119,7 +119,7 @@
           <w:b w:val="0"/>
           <w:i w:val="0"/>
         </w:rPr>
-        <w:t>, which focuses on semiconductor manufacturing equipment providers and their suppliers: a qualitative multiple case study (Benton, 2019), a quantitative survey study (Ponomarov, 2012), and a multiphase mixed methods study (Pettit, 2008). A closing synthesis draws lessons for the proposed study.</w:t>
+        <w:t>, which examines semiconductor manufacturing equipment providers and their suppliers. This paper reviews three dissertations on supply chain disruption and resilience: a qualitative multiple case study (Benton, 2019), a quantitative survey study (Ponomarov, 2012), and a multiphase mixed methods study (Pettit, 2008). A closing synthesis draws lessons for the proposed study.</w:t>
       </w:r>
     </w:p>
     <w:p>
@@ -157,7 +157,7 @@
           <w:b w:val="0"/>
           <w:i w:val="0"/>
         </w:rPr>
-        <w:t>Benton (2019) addressed the problem that supply chain disruptions erode manufacturers' profitability and that some managers lack effective mitigation strategies. The purpose was to explore the strategies manufacturing managers use to mitigate disruptions to remain profitable. The central research question asked what strategies manufacturing managers use to mitigate supply chain disruptions to remain profitable. Consistent with exploratory qualitative inquiry, the study stated no hypotheses.</w:t>
+        <w:t>Benton (2019) addressed the problem that supply chain disruptions erode manufacturers' profitability and that some managers lack effective mitigation strategies. The purpose was to explore the strategies manufacturing managers use to mitigate disruptions to remain profitable, and the central research question asked what those strategies are. Consistent with exploratory qualitative inquiry, the study stated no hypotheses.</w:t>
       </w:r>
     </w:p>
     <w:p>
@@ -182,7 +182,7 @@
           <w:b w:val="0"/>
           <w:i w:val="0"/>
         </w:rPr>
-        <w:t>Benton (2019) selected a qualitative methodology because the goal was to understand how practitioners experience and respond to disruptions, not to test relationships among variables. The design was a multiple case study of two manufacturing firms in eastern Virginia, with four purposively selected supply chain managers who had successfully implemented mitigation strategies. Contingency theory of fit, which links performance to aligning practices with environmental conditions, framed the study.</w:t>
+        <w:t>A qualitative methodology fit the goal of understanding how practitioners respond to disruptions rather than testing relationships among variables. The design was a multiple case study of two manufacturing firms in eastern Virginia, with four purposively selected supply chain managers who had successfully implemented mitigation strategies. Contingency theory of fit, which links performance to aligning practices with environmental conditions, framed the study (Benton, 2019).</w:t>
       </w:r>
     </w:p>
     <w:p>
@@ -207,7 +207,7 @@
           <w:b w:val="0"/>
           <w:i w:val="0"/>
         </w:rPr>
-        <w:t>The researcher was the primary instrument. Data came from semistructured interviews guided by an interview protocol, company documents, and publicly available information about the participating firms. Using several data sources allowed methodological triangulation. Benton (2019) used thematic analysis: transcripts and documents were coded, codes were grouped and compared across participants and firms until recurring themes emerged, and the themes were interpreted through contingency theory and the supply chain risk literature.</w:t>
+        <w:t>The researcher was the primary instrument. Data came from semistructured interviews guided by an interview protocol, company documents, and publicly available information, which allowed methodological triangulation. Benton (2019) used thematic analysis: transcripts and documents were coded, codes were compared across participants and firms until recurring themes emerged, and the themes were interpreted through contingency theory.</w:t>
       </w:r>
     </w:p>
     <w:p>
@@ -257,7 +257,7 @@
           <w:b w:val="0"/>
           <w:i w:val="0"/>
         </w:rPr>
-        <w:t>Research with human participants requires institutional review board (IRB) approval, informed consent, and the right to withdraw. Small samples from identifiable firms risk reidentification, so pseudonyms, secure storage, and confidentiality for people and organizations are essential. Legally, company documents may contain proprietary terms covered by nondisclosure agreements, which limits how they can be quoted.</w:t>
+        <w:t>Research with human participants requires institutional review board (IRB) approval, informed consent, and the right to withdraw. Small samples from identifiable firms risk reidentification, so pseudonyms and secure storage are essential. Legally, company documents may contain proprietary terms covered by nondisclosure agreements, which limits how they can be quoted.</w:t>
       </w:r>
     </w:p>
     <w:p>
@@ -295,7 +295,7 @@
           <w:b w:val="0"/>
           <w:i w:val="0"/>
         </w:rPr>
-        <w:t>Ponomarov (2012) addressed a gap: resilience had been discussed conceptually, but little empirical evidence showed which firm capabilities produce it or whether it creates measurable value. The purpose was to examine the antecedents and value-based consequences of supply chain resilience from the perspective of the individual firm. The guiding questions asked which organizational orientations and capabilities lead to resilience and what outcomes resilience produces for the firm. The hypothesized model, grounded in a dynamic capabilities extension of the resource-based view, proposed directional relationships linking supply chain orientation and risk management orientation to logistics capabilities, logistics capabilities to supply chain resilience, and resilience to firm-level consequences.</w:t>
+        <w:t>Ponomarov (2012) addressed a gap: resilience had been discussed conceptually, but little empirical evidence showed which firm capabilities produce it or whether it creates value. The purpose was to examine the antecedents and value-based consequences of supply chain resilience at the firm level. The questions asked which orientations and capabilities lead to resilience and what outcomes it produces. Grounded in a dynamic capabilities extension of the resource-based view, the hypotheses linked supply chain orientation and risk management orientation to logistics capabilities, logistics capabilities to resilience, and resilience to firm-level consequences.</w:t>
       </w:r>
     </w:p>
     <w:p>
@@ -345,7 +345,7 @@
           <w:b w:val="0"/>
           <w:i w:val="0"/>
         </w:rPr>
-        <w:t>The primary instrument was a structured questionnaire made up of multi-item measurement scales for each construct, including supply chain orientation, risk management orientation, logistics capabilities, and supply chain resilience (Ponomarov, 2012), allowing reliability and validity to be assessed statistically. Ponomarov (2012) analyzed the data with structural equation modeling (SEM). SEM proceeds in two stages: assessing the measurement model to confirm that each scale is reliable and that constructs show convergent and discriminant validity, then estimating the structural model to test the hypothesized paths, including indirect effects, simultaneously.</w:t>
+        <w:t>The instrument was a structured questionnaire of multi-item scales measuring supply chain orientation, risk management orientation, logistics capabilities, and supply chain resilience. Ponomarov (2012) analyzed the data with structural equation modeling (SEM), first assessing the measurement model for reliability and convergent and discriminant validity, then estimating the structural model to test the hypothesized paths simultaneously.</w:t>
       </w:r>
     </w:p>
     <w:p>
@@ -370,7 +370,7 @@
           <w:b w:val="0"/>
           <w:i w:val="0"/>
         </w:rPr>
-        <w:t>The results supported a capability-based explanation of resilience. Firms' orientations toward supply chain management and risk management influenced the logistics capabilities they developed, and those capabilities contributed to supply chain resilience, which in turn carried value-based consequences for the firm (Ponomarov, 2012).</w:t>
+        <w:t>The results supported a capability-based explanation of resilience. Firms' orientations toward supply chain and risk management shaped the logistics capabilities they developed, and those capabilities contributed to resilience, which carried value-based consequences for the firm (Ponomarov, 2012).</w:t>
       </w:r>
     </w:p>
     <w:p>
@@ -395,7 +395,7 @@
           <w:b w:val="0"/>
           <w:i w:val="0"/>
         </w:rPr>
-        <w:t>Survey research with professionals requires IRB review, informed consent, and protection of respondent anonymity, particularly when questions touch on competitively sensitive practices. Researchers must also test for common method bias and report unsupported hypotheses transparently. Legally, electronically collected responses must comply with data privacy requirements.</w:t>
+        <w:t>Survey research with professionals requires IRB review, informed consent, and respondent anonymity, particularly when questions touch on competitively sensitive practices. Researchers must also test for common method bias and report unsupported hypotheses transparently. Legally, electronically collected responses must comply with data privacy requirements.</w:t>
       </w:r>
     </w:p>
     <w:p>
@@ -433,7 +433,7 @@
           <w:b w:val="0"/>
           <w:i w:val="0"/>
         </w:rPr>
-        <w:t>Pettit (2008) addressed the absence of an integrated, measurable framework for assessing and improving supply chain resilience. The purpose was threefold: to develop a conceptual framework of resilience, to create and validate an assessment tool, and to identify an implementation process. The research questions asked what constitutes supply chain resilience, whether it can be measured reliably, and which linkages between resilience factors should guide improvement. In place of formal statistical hypotheses, the framework advanced propositions, notably that firms should seek a balanced zone in which capabilities match vulnerabilities without excessive cost.</w:t>
+        <w:t>Pettit (2008) addressed the absence of an integrated, measurable framework for assessing and improving supply chain resilience. The purpose was to develop a conceptual framework, create and validate an assessment tool, and identify an implementation process. The research questions asked what constitutes resilience, whether it can be measured reliably, and which linkages between resilience factors should guide improvement. Instead of statistical hypotheses, the framework advanced propositions, notably that firms should seek a balanced zone in which capabilities match vulnerabilities without excessive cost.</w:t>
       </w:r>
     </w:p>
     <w:p>
@@ -458,7 +458,7 @@
           <w:b w:val="0"/>
           <w:i w:val="0"/>
         </w:rPr>
-        <w:t>The methodology was mixed methods, with a multiphase sequential design (Pettit, 2008). Phase I built the conceptual framework from the literature and refined it with practitioner focus groups (qualitative). Phase II developed and validated a resilience assessment tool by comparing quantitative assessment scores with qualitative data from focus groups at participating global manufacturing and service firms that reviewed recent disruptions. Phase III identified critical linkages among resilience factors.</w:t>
+        <w:t>The methodology was mixed methods with a multiphase sequential design (Pettit, 2008). Phase I built the framework from the literature and refined it with practitioner focus groups. Phase II validated an assessment tool by comparing quantitative scores with focus group data from global manufacturing and service firms that reviewed recent disruptions. Phase III identified critical linkages among resilience factors. Published supply chain studies show the same logic in concurrent form: Bimha et al. (2019) used a concurrent parallel design to study petroleum industry competitiveness, Asamoah et al. (2021) combined a survey, site observation, and key informant interviews to assess vaccine cold chain management, and Namisango et al. (2017) paired document review and group interviews with a key informant survey across three countries.</w:t>
       </w:r>
     </w:p>
     <w:p>
@@ -483,7 +483,7 @@
           <w:b w:val="0"/>
           <w:i w:val="0"/>
         </w:rPr>
-        <w:t>The instruments included focus group protocols for eliciting practitioner experience with disruptions and a structured self-assessment questionnaire built from the attributes of the framework. Respondents rated their firm's exposure on vulnerability attributes and its strength on capability attributes (Pettit, 2008). Qualitative focus group data were coded and mapped to framework factors, and quantitative assessment results were scored and examined through correlations. Pettit (2008) then used triangulation across theoretical linkages, assessment correlations, and focus group connections, which is the defining integration step of a mixed methods study, to determine which capabilities addressed which vulnerabilities.</w:t>
+        <w:t>The instruments were focus group protocols and a structured self-assessment questionnaire on which respondents rated their firm's exposure on vulnerability attributes and its strength on capability attributes. Focus group data were coded and mapped to framework factors, and assessment scores were examined through correlations. Pettit (2008) then triangulated theoretical linkages, assessment correlations, and focus group connections, which is the defining integration step of mixed methods research.</w:t>
       </w:r>
     </w:p>
     <w:p>
@@ -508,7 +508,7 @@
           <w:b w:val="0"/>
           <w:i w:val="0"/>
         </w:rPr>
-        <w:t>Pettit (2008) found that resilience can be assessed along two dimensions, vulnerabilities and capabilities. The study identified seven vulnerability factors comprising 40 attributes and 14 capability factors comprising 71 attributes. Triangulation produced 311 specific linkages that leaders can use to prioritize resilience investments, and the assessment tool was validated.</w:t>
+        <w:t>Resilience can be assessed along two dimensions, vulnerabilities and capabilities. The study identified seven vulnerability factors comprising 40 attributes and 14 capability factors comprising 71 attributes, and triangulation produced 311 specific linkages that leaders can use to prioritize resilience investments (Pettit, 2008).</w:t>
       </w:r>
     </w:p>
     <w:p>
@@ -533,7 +533,7 @@
           <w:b w:val="0"/>
           <w:i w:val="0"/>
         </w:rPr>
-        <w:t>Research inside corporations requires keeping firm identities and disruption histories confidential and reporting in aggregate. Focus groups limit confidentiality because participants hear one another, and university-industry collaboration requires managing conflicts of interest. Legally, the assessment tool later developed into a trademarked instrument, which raises intellectual property questions about ownership and the licensing of research products.</w:t>
+        <w:t>Research inside corporations requires keeping firm identities and disruption histories confidential and reporting in aggregate. Focus groups limit confidentiality because participants hear one another, and university-industry collaboration requires managing conflicts of interest. Legally, the assessment tool later became a trademarked instrument, which raises intellectual property questions. Law can also shape the supply chain itself; Namisango et al. (2017) found that restrictive controlled-medicines legislation was a major barrier to opioid availability.</w:t>
       </w:r>
     </w:p>
     <w:p>
@@ -558,7 +558,7 @@
           <w:b w:val="0"/>
           <w:i w:val="0"/>
         </w:rPr>
-        <w:t>The research lifecycle changes with methodology. Benton (2019) began with a practical question and built understanding inductively from a small number of information-rich participants. Ponomarov (2012) began with theory, derived hypotheses, and tested them deductively across a broader sample. Pettit (2008) combined both logics. The findings converge. Supplier collaboration, information visibility, multiple sourcing, flexibility, and deliberate capability building appear across all three, and these are the same mitigation levers named in my proposed framework.</w:t>
+        <w:t>The research lifecycle changes with methodology. Benton (2019) built understanding inductively from a few information-rich participants, Ponomarov (2012) tested theory-derived hypotheses across a broader sample, and Pettit (2008) combined both logics. The findings converge on supplier collaboration, visibility, multiple sourcing, flexibility, and deliberate capability building. Modeling research points the same way: Kouvelis et al. (2023) show that inventories, time buffers, and supplier flexibility work together to manage material shortages, and Singh et al. (2026) build shortage mechanisms directly into supply chain optimization, which supports the analytics component of my proposed framework.</w:t>
       </w:r>
     </w:p>
     <w:p>
@@ -570,7 +570,7 @@
           <w:b w:val="0"/>
           <w:i w:val="0"/>
         </w:rPr>
-        <w:t>For the proposed qualitative case study of semiconductor ramp-up, Benton's (2019) design offers a direct model for semistructured interviews, document review, and thematic analysis with equipment providers and their suppliers. Ponomarov's (2012) constructs can inform interview coding categories, and Pettit's (2008) vulnerability-capability lens can structure analysis of material shortages, long lead times, and shifts in supplier-buyer power. The semiconductor context sharpens ethical and legal concerns: participants' firms operate under strict nondisclosure agreements, and equipment and materials data may be subject to export control regulations, so IRB approval, informed consent, de-identification of firms, and careful screening of proprietary documents will be central to the proposed research.</w:t>
+        <w:t>For the proposed qualitative case study, Benton's (2019) design offers a model for interviews, document review, and thematic analysis with equipment providers and suppliers, while Ponomarov's (2012) constructs and Pettit's (2008) vulnerability-capability lens can structure the coding of shortages, lead times, and shifts in supplier-buyer power. The semiconductor context sharpens the ethical and legal concerns, because firms operate under strict nondisclosure agreements and equipment data may be subject to export controls. IRB approval, informed consent, de-identification of firms, and careful screening of proprietary documents will therefore be central to the proposed research.</w:t>
       </w:r>
     </w:p>
     <w:p>
@@ -595,6 +595,29 @@
         <w:rPr>
           <w:i w:val="0"/>
         </w:rPr>
+        <w:t xml:space="preserve">Asamoah, A., Enyan, N. I. E., Diji, A. K., &amp; Domfeh, C. (2021). Cold chain management by healthcare providers at a district in Ghana: A mixed methods study. </w:t>
+      </w:r>
+      <w:r>
+        <w:rPr>
+          <w:i/>
+        </w:rPr>
+        <w:t>BioMed Research International, 2021</w:t>
+      </w:r>
+      <w:r>
+        <w:rPr>
+          <w:i w:val="0"/>
+        </w:rPr>
+        <w:t>(1), 7559984. https://doi.org/10.1155/2021/7559984</w:t>
+      </w:r>
+    </w:p>
+    <w:p>
+      <w:pPr>
+        <w:ind w:left="720" w:hanging="720"/>
+      </w:pPr>
+      <w:r>
+        <w:rPr>
+          <w:i w:val="0"/>
+        </w:rPr>
         <w:t xml:space="preserve">Benton, V. K. (2019). </w:t>
       </w:r>
       <w:r>
@@ -608,6 +631,75 @@
           <w:i w:val="0"/>
         </w:rPr>
         <w:t xml:space="preserve"> [Doctoral dissertation, Walden University]. Walden Dissertations and Doctoral Studies. https://scholarworks.waldenu.edu/dissertations/7855</w:t>
+      </w:r>
+    </w:p>
+    <w:p>
+      <w:pPr>
+        <w:ind w:left="720" w:hanging="720"/>
+      </w:pPr>
+      <w:r>
+        <w:rPr>
+          <w:i w:val="0"/>
+        </w:rPr>
+        <w:t xml:space="preserve">Bimha, H., Hoque, M., &amp; Munapo, E. (2019). The impact of supply chain management practices on industry competitiveness: A mixed-methods study on the Zimbabwean petroleum industry. </w:t>
+      </w:r>
+      <w:r>
+        <w:rPr>
+          <w:i/>
+        </w:rPr>
+        <w:t>African Journal of Science, Technology, Innovation and Development, 12</w:t>
+      </w:r>
+      <w:r>
+        <w:rPr>
+          <w:i w:val="0"/>
+        </w:rPr>
+        <w:t>(1), 97–109. https://doi.org/10.1080/20421338.2019.1613785</w:t>
+      </w:r>
+    </w:p>
+    <w:p>
+      <w:pPr>
+        <w:ind w:left="720" w:hanging="720"/>
+      </w:pPr>
+      <w:r>
+        <w:rPr>
+          <w:i w:val="0"/>
+        </w:rPr>
+        <w:t xml:space="preserve">Kouvelis, P., Chen, X., &amp; Xia, Y. (2023). Managing material shortages in project supply chains: Inventories, time buffers, and supplier flexibility. </w:t>
+      </w:r>
+      <w:r>
+        <w:rPr>
+          <w:i/>
+        </w:rPr>
+        <w:t>Production and Operations Management, 32</w:t>
+      </w:r>
+      <w:r>
+        <w:rPr>
+          <w:i w:val="0"/>
+        </w:rPr>
+        <w:t>(11), 3717–3735. https://doi.org/10.1111/poms.14059</w:t>
+      </w:r>
+    </w:p>
+    <w:p>
+      <w:pPr>
+        <w:ind w:left="720" w:hanging="720"/>
+      </w:pPr>
+      <w:r>
+        <w:rPr>
+          <w:i w:val="0"/>
+        </w:rPr>
+        <w:t xml:space="preserve">Namisango, E., Allsop, M. J., Powell, R. A., Friedrichsdorf, S. J., Luyirika, E. B., Kiyange, F., Mukooza, E., Ntege, C., Garanganga, E., Ginindza-Mdluli, M. N., Mwangi-Powell, F., Mondlane, L. J., &amp; Harding, R. (2017). Investigation of the practices, legislation, supply chain, and regulation of opioids for clinical pain management in Southern Africa: A multi-sectoral, cross-national, mixed methods study. </w:t>
+      </w:r>
+      <w:r>
+        <w:rPr>
+          <w:i/>
+        </w:rPr>
+        <w:t>Journal of Pain and Symptom Management, 55</w:t>
+      </w:r>
+      <w:r>
+        <w:rPr>
+          <w:i w:val="0"/>
+        </w:rPr>
+        <w:t>(3), 851–863. https://doi.org/10.1016/j.jpainsymman.2017.11.010</w:t>
       </w:r>
     </w:p>
     <w:p>
@@ -654,6 +746,29 @@
           <w:i w:val="0"/>
         </w:rPr>
         <w:t xml:space="preserve"> [Doctoral dissertation, University of Tennessee]. TRACE: Tennessee Research and Creative Exchange. https://trace.tennessee.edu/utk_graddiss/1338</w:t>
+      </w:r>
+    </w:p>
+    <w:p>
+      <w:pPr>
+        <w:ind w:left="720" w:hanging="720"/>
+      </w:pPr>
+      <w:r>
+        <w:rPr>
+          <w:i w:val="0"/>
+        </w:rPr>
+        <w:t xml:space="preserve">Singh, J., Jaggi, C. K., &amp; Singh, M. (2026). An integrated humanitarian supply chain optimization model incorporating shortage mechanism and realistic constraints. </w:t>
+      </w:r>
+      <w:r>
+        <w:rPr>
+          <w:i/>
+        </w:rPr>
+        <w:t>Process Integration and Optimization for Sustainability</w:t>
+      </w:r>
+      <w:r>
+        <w:rPr>
+          <w:i w:val="0"/>
+        </w:rPr>
+        <w:t>. https://doi.org/10.1007/s41660-026-00723-y</w:t>
       </w:r>
     </w:p>
     <w:sectPr>

</xml_diff>

<commit_message>
Add data visuals, comparison table, and shortage risk-scoring algorithm
Adds Table 1 (lifecycle comparison), Figures 1-3 (lifecycle swimlanes,
Pettit framework counts, Asamoah et al. data strands), and an appendix
with Algorithm A1, its flowchart, and an illustrative worked example
(clearly labeled hypothetical). Body text remains six pages.

Co-Authored-By: Claude Opus 5.5 <noreply@anthropic.com>
Claude-Session: https://claude.ai/code/session_01XnYwi52cCfyVyiDXeuekrB
</commit_message>
<xml_diff>
--- a/Research_Lifecycle_Three_Dissertations.docx
+++ b/Research_Lifecycle_Three_Dissertations.docx
@@ -119,7 +119,7 @@
           <w:b w:val="0"/>
           <w:i w:val="0"/>
         </w:rPr>
-        <w:t>, which examines semiconductor manufacturing equipment providers and their suppliers. This paper reviews three dissertations on supply chain disruption and resilience: a qualitative multiple case study (Benton, 2019), a quantitative survey study (Ponomarov, 2012), and a multiphase mixed methods study (Pettit, 2008). A closing synthesis draws lessons for the proposed study.</w:t>
+        <w:t>, which examines semiconductor manufacturing equipment providers and their suppliers. This paper reviews three dissertations on supply chain disruption and resilience: a qualitative multiple case study (Benton, 2019), a quantitative survey study (Ponomarov, 2012), and a multiphase mixed methods study (Pettit, 2008), compared in Table 1 and Figure 1. A closing synthesis draws lessons for the proposed study.</w:t>
       </w:r>
     </w:p>
     <w:p>
@@ -458,7 +458,7 @@
           <w:b w:val="0"/>
           <w:i w:val="0"/>
         </w:rPr>
-        <w:t>The methodology was mixed methods with a multiphase sequential design (Pettit, 2008). Phase I built the framework from the literature and refined it with practitioner focus groups. Phase II validated an assessment tool by comparing quantitative scores with focus group data from global manufacturing and service firms that reviewed recent disruptions. Phase III identified critical linkages among resilience factors. Published supply chain studies show the same logic in concurrent form: Bimha et al. (2019) used a concurrent parallel design to study petroleum industry competitiveness, Asamoah et al. (2021) combined a survey, site observation, and key informant interviews to assess vaccine cold chain management, and Namisango et al. (2017) paired document review and group interviews with a key informant survey across three countries.</w:t>
+        <w:t>The methodology was mixed methods with a multiphase sequential design (Pettit, 2008). Phase I built the framework from the literature and refined it with practitioner focus groups. Phase II validated an assessment tool by comparing quantitative scores with focus group data from global manufacturing and service firms that reviewed recent disruptions. Phase III identified critical linkages among resilience factors. Published supply chain studies show the same logic in concurrent form: Bimha et al. (2019) used a concurrent parallel design to study petroleum industry competitiveness, Asamoah et al. (2021) combined a survey, site observation, and key informant interviews to assess vaccine cold chain management (see Figure 3), and Namisango et al. (2017) paired document review and group interviews with a key informant survey across three countries.</w:t>
       </w:r>
     </w:p>
     <w:p>
@@ -508,7 +508,7 @@
           <w:b w:val="0"/>
           <w:i w:val="0"/>
         </w:rPr>
-        <w:t>Resilience can be assessed along two dimensions, vulnerabilities and capabilities. The study identified seven vulnerability factors comprising 40 attributes and 14 capability factors comprising 71 attributes, and triangulation produced 311 specific linkages that leaders can use to prioritize resilience investments (Pettit, 2008).</w:t>
+        <w:t>Resilience can be assessed along two dimensions, vulnerabilities and capabilities. The study identified seven vulnerability factors comprising 40 attributes and 14 capability factors comprising 71 attributes, and triangulation produced 311 specific linkages that leaders can use to prioritize resilience investments (Pettit, 2008; see Figure 2).</w:t>
       </w:r>
     </w:p>
     <w:p>
@@ -558,7 +558,7 @@
           <w:b w:val="0"/>
           <w:i w:val="0"/>
         </w:rPr>
-        <w:t>The research lifecycle changes with methodology. Benton (2019) built understanding inductively from a few information-rich participants, Ponomarov (2012) tested theory-derived hypotheses across a broader sample, and Pettit (2008) combined both logics. The findings converge on supplier collaboration, visibility, multiple sourcing, flexibility, and deliberate capability building. Modeling research points the same way: Kouvelis et al. (2023) show that inventories, time buffers, and supplier flexibility work together to manage material shortages, and Singh et al. (2026) build shortage mechanisms directly into supply chain optimization, which supports the analytics component of my proposed framework.</w:t>
+        <w:t>The research lifecycle changes with methodology. Benton (2019) built understanding inductively from a few information-rich participants, Ponomarov (2012) tested theory-derived hypotheses across a broader sample, and Pettit (2008) combined both logics. The findings converge on supplier collaboration, visibility, multiple sourcing, flexibility, and deliberate capability building. Modeling research points the same way: Kouvelis et al. (2023) show that inventories, time buffers, and supplier flexibility work together to manage material shortages, and Singh et al. (2026) build shortage mechanisms directly into supply chain optimization, which supports the analytics component of my proposed framework. The Appendix translates these findings into a risk-scoring algorithm with an illustrative example.</w:t>
       </w:r>
     </w:p>
     <w:p>
@@ -769,6 +769,3478 @@
           <w:i w:val="0"/>
         </w:rPr>
         <w:t>. https://doi.org/10.1007/s41660-026-00723-y</w:t>
+      </w:r>
+    </w:p>
+    <w:p>
+      <w:pPr>
+        <w:keepNext/>
+        <w:pageBreakBefore/>
+      </w:pPr>
+      <w:r>
+        <w:rPr>
+          <w:b/>
+          <w:i w:val="0"/>
+        </w:rPr>
+        <w:t>Table 1</w:t>
+      </w:r>
+    </w:p>
+    <w:p>
+      <w:pPr>
+        <w:keepNext/>
+      </w:pPr>
+      <w:r>
+        <w:rPr>
+          <w:b w:val="0"/>
+          <w:i/>
+        </w:rPr>
+        <w:t>Comparison of the Research Lifecycle Across the Three Dissertations</w:t>
+      </w:r>
+    </w:p>
+    <w:tbl>
+      <w:tblPr>
+        <w:tblStyle w:val="TableGrid"/>
+        <w:tblW w:type="auto" w:w="0"/>
+        <w:jc w:val="center"/>
+        <w:tblLayout w:type="fixed"/>
+        <w:tblLook w:firstColumn="1" w:firstRow="1" w:lastColumn="0" w:lastRow="0" w:noHBand="0" w:noVBand="1" w:val="04A0"/>
+        <w:tblLayout w:type="fixed"/>
+      </w:tblPr>
+      <w:tblGrid>
+        <w:gridCol w:w="1728"/>
+        <w:gridCol w:w="2520"/>
+        <w:gridCol w:w="2520"/>
+        <w:gridCol w:w="2592"/>
+      </w:tblGrid>
+      <w:tr>
+        <w:tc>
+          <w:tcPr>
+            <w:tcW w:type="dxa" w:w="1728"/>
+            <w:shd w:val="clear" w:color="auto" w:fill="2A78D6"/>
+          </w:tcPr>
+          <w:p>
+            <w:pPr>
+              <w:spacing w:line="240" w:lineRule="auto"/>
+              <w:ind w:firstLine="0"/>
+            </w:pPr>
+            <w:r/>
+            <w:r>
+              <w:rPr>
+                <w:b/>
+                <w:color w:val="FFFFFF"/>
+                <w:sz w:val="19"/>
+              </w:rPr>
+              <w:t>Element</w:t>
+            </w:r>
+          </w:p>
+        </w:tc>
+        <w:tc>
+          <w:tcPr>
+            <w:tcW w:type="dxa" w:w="2520"/>
+            <w:shd w:val="clear" w:color="auto" w:fill="2A78D6"/>
+          </w:tcPr>
+          <w:p>
+            <w:pPr>
+              <w:spacing w:line="240" w:lineRule="auto"/>
+              <w:ind w:firstLine="0"/>
+            </w:pPr>
+            <w:r/>
+            <w:r>
+              <w:rPr>
+                <w:b/>
+                <w:color w:val="FFFFFF"/>
+                <w:sz w:val="19"/>
+              </w:rPr>
+              <w:t>Benton (2019)</w:t>
+            </w:r>
+          </w:p>
+        </w:tc>
+        <w:tc>
+          <w:tcPr>
+            <w:tcW w:type="dxa" w:w="2520"/>
+            <w:shd w:val="clear" w:color="auto" w:fill="2A78D6"/>
+          </w:tcPr>
+          <w:p>
+            <w:pPr>
+              <w:spacing w:line="240" w:lineRule="auto"/>
+              <w:ind w:firstLine="0"/>
+            </w:pPr>
+            <w:r/>
+            <w:r>
+              <w:rPr>
+                <w:b/>
+                <w:color w:val="FFFFFF"/>
+                <w:sz w:val="19"/>
+              </w:rPr>
+              <w:t>Ponomarov (2012)</w:t>
+            </w:r>
+          </w:p>
+        </w:tc>
+        <w:tc>
+          <w:tcPr>
+            <w:tcW w:type="dxa" w:w="2592"/>
+            <w:shd w:val="clear" w:color="auto" w:fill="2A78D6"/>
+          </w:tcPr>
+          <w:p>
+            <w:pPr>
+              <w:spacing w:line="240" w:lineRule="auto"/>
+              <w:ind w:firstLine="0"/>
+            </w:pPr>
+            <w:r/>
+            <w:r>
+              <w:rPr>
+                <w:b/>
+                <w:color w:val="FFFFFF"/>
+                <w:sz w:val="19"/>
+              </w:rPr>
+              <w:t>Pettit (2008)</w:t>
+            </w:r>
+          </w:p>
+        </w:tc>
+      </w:tr>
+      <w:tr>
+        <w:tc>
+          <w:tcPr>
+            <w:tcW w:type="dxa" w:w="1728"/>
+          </w:tcPr>
+          <w:p>
+            <w:pPr>
+              <w:spacing w:line="240" w:lineRule="auto"/>
+              <w:ind w:firstLine="0"/>
+            </w:pPr>
+            <w:r/>
+            <w:r>
+              <w:rPr>
+                <w:b/>
+                <w:sz w:val="19"/>
+              </w:rPr>
+              <w:t>Method</w:t>
+            </w:r>
+          </w:p>
+        </w:tc>
+        <w:tc>
+          <w:tcPr>
+            <w:tcW w:type="dxa" w:w="2520"/>
+            <w:shd w:val="clear" w:color="auto" w:fill="CDE2FB"/>
+          </w:tcPr>
+          <w:p>
+            <w:pPr>
+              <w:spacing w:line="240" w:lineRule="auto"/>
+              <w:ind w:firstLine="0"/>
+            </w:pPr>
+            <w:r/>
+            <w:r>
+              <w:rPr>
+                <w:b w:val="0"/>
+                <w:sz w:val="19"/>
+              </w:rPr>
+              <w:t>Qualitative</w:t>
+            </w:r>
+          </w:p>
+        </w:tc>
+        <w:tc>
+          <w:tcPr>
+            <w:tcW w:type="dxa" w:w="2520"/>
+            <w:shd w:val="clear" w:color="auto" w:fill="FBD9C8"/>
+          </w:tcPr>
+          <w:p>
+            <w:pPr>
+              <w:spacing w:line="240" w:lineRule="auto"/>
+              <w:ind w:firstLine="0"/>
+            </w:pPr>
+            <w:r/>
+            <w:r>
+              <w:rPr>
+                <w:b w:val="0"/>
+                <w:sz w:val="19"/>
+              </w:rPr>
+              <w:t>Quantitative</w:t>
+            </w:r>
+          </w:p>
+        </w:tc>
+        <w:tc>
+          <w:tcPr>
+            <w:tcW w:type="dxa" w:w="2592"/>
+            <w:shd w:val="clear" w:color="auto" w:fill="C9EFE0"/>
+          </w:tcPr>
+          <w:p>
+            <w:pPr>
+              <w:spacing w:line="240" w:lineRule="auto"/>
+              <w:ind w:firstLine="0"/>
+            </w:pPr>
+            <w:r/>
+            <w:r>
+              <w:rPr>
+                <w:b w:val="0"/>
+                <w:sz w:val="19"/>
+              </w:rPr>
+              <w:t>Mixed methods</w:t>
+            </w:r>
+          </w:p>
+        </w:tc>
+      </w:tr>
+      <w:tr>
+        <w:tc>
+          <w:tcPr>
+            <w:tcW w:type="dxa" w:w="1728"/>
+          </w:tcPr>
+          <w:p>
+            <w:pPr>
+              <w:spacing w:line="240" w:lineRule="auto"/>
+              <w:ind w:firstLine="0"/>
+            </w:pPr>
+            <w:r/>
+            <w:r>
+              <w:rPr>
+                <w:b/>
+                <w:sz w:val="19"/>
+              </w:rPr>
+              <w:t>Problem</w:t>
+            </w:r>
+          </w:p>
+        </w:tc>
+        <w:tc>
+          <w:tcPr>
+            <w:tcW w:type="dxa" w:w="2520"/>
+            <w:shd w:val="clear" w:color="auto" w:fill="CDE2FB"/>
+          </w:tcPr>
+          <w:p>
+            <w:pPr>
+              <w:spacing w:line="240" w:lineRule="auto"/>
+              <w:ind w:firstLine="0"/>
+            </w:pPr>
+            <w:r/>
+            <w:r>
+              <w:rPr>
+                <w:b w:val="0"/>
+                <w:sz w:val="19"/>
+              </w:rPr>
+              <w:t>Managers lack strategies to mitigate disruptions</w:t>
+            </w:r>
+          </w:p>
+        </w:tc>
+        <w:tc>
+          <w:tcPr>
+            <w:tcW w:type="dxa" w:w="2520"/>
+            <w:shd w:val="clear" w:color="auto" w:fill="FBD9C8"/>
+          </w:tcPr>
+          <w:p>
+            <w:pPr>
+              <w:spacing w:line="240" w:lineRule="auto"/>
+              <w:ind w:firstLine="0"/>
+            </w:pPr>
+            <w:r/>
+            <w:r>
+              <w:rPr>
+                <w:b w:val="0"/>
+                <w:sz w:val="19"/>
+              </w:rPr>
+              <w:t>Little evidence on what drives resilience</w:t>
+            </w:r>
+          </w:p>
+        </w:tc>
+        <w:tc>
+          <w:tcPr>
+            <w:tcW w:type="dxa" w:w="2592"/>
+            <w:shd w:val="clear" w:color="auto" w:fill="C9EFE0"/>
+          </w:tcPr>
+          <w:p>
+            <w:pPr>
+              <w:spacing w:line="240" w:lineRule="auto"/>
+              <w:ind w:firstLine="0"/>
+            </w:pPr>
+            <w:r/>
+            <w:r>
+              <w:rPr>
+                <w:b w:val="0"/>
+                <w:sz w:val="19"/>
+              </w:rPr>
+              <w:t>No integrated, measurable resilience framework</w:t>
+            </w:r>
+          </w:p>
+        </w:tc>
+      </w:tr>
+      <w:tr>
+        <w:tc>
+          <w:tcPr>
+            <w:tcW w:type="dxa" w:w="1728"/>
+          </w:tcPr>
+          <w:p>
+            <w:pPr>
+              <w:spacing w:line="240" w:lineRule="auto"/>
+              <w:ind w:firstLine="0"/>
+            </w:pPr>
+            <w:r/>
+            <w:r>
+              <w:rPr>
+                <w:b/>
+                <w:sz w:val="19"/>
+              </w:rPr>
+              <w:t>Questions / hypotheses</w:t>
+            </w:r>
+          </w:p>
+        </w:tc>
+        <w:tc>
+          <w:tcPr>
+            <w:tcW w:type="dxa" w:w="2520"/>
+            <w:shd w:val="clear" w:color="auto" w:fill="CDE2FB"/>
+          </w:tcPr>
+          <w:p>
+            <w:pPr>
+              <w:spacing w:line="240" w:lineRule="auto"/>
+              <w:ind w:firstLine="0"/>
+            </w:pPr>
+            <w:r/>
+            <w:r>
+              <w:rPr>
+                <w:b w:val="0"/>
+                <w:sz w:val="19"/>
+              </w:rPr>
+              <w:t>Central RQ on mitigation strategies; no hypotheses</w:t>
+            </w:r>
+          </w:p>
+        </w:tc>
+        <w:tc>
+          <w:tcPr>
+            <w:tcW w:type="dxa" w:w="2520"/>
+            <w:shd w:val="clear" w:color="auto" w:fill="FBD9C8"/>
+          </w:tcPr>
+          <w:p>
+            <w:pPr>
+              <w:spacing w:line="240" w:lineRule="auto"/>
+              <w:ind w:firstLine="0"/>
+            </w:pPr>
+            <w:r/>
+            <w:r>
+              <w:rPr>
+                <w:b w:val="0"/>
+                <w:sz w:val="19"/>
+              </w:rPr>
+              <w:t>Hypothesized paths: orientations → capabilities → resilience → value</w:t>
+            </w:r>
+          </w:p>
+        </w:tc>
+        <w:tc>
+          <w:tcPr>
+            <w:tcW w:type="dxa" w:w="2592"/>
+            <w:shd w:val="clear" w:color="auto" w:fill="C9EFE0"/>
+          </w:tcPr>
+          <w:p>
+            <w:pPr>
+              <w:spacing w:line="240" w:lineRule="auto"/>
+              <w:ind w:firstLine="0"/>
+            </w:pPr>
+            <w:r/>
+            <w:r>
+              <w:rPr>
+                <w:b w:val="0"/>
+                <w:sz w:val="19"/>
+              </w:rPr>
+              <w:t>Phase-based RQs; propositions on balanced resilience</w:t>
+            </w:r>
+          </w:p>
+        </w:tc>
+      </w:tr>
+      <w:tr>
+        <w:tc>
+          <w:tcPr>
+            <w:tcW w:type="dxa" w:w="1728"/>
+          </w:tcPr>
+          <w:p>
+            <w:pPr>
+              <w:spacing w:line="240" w:lineRule="auto"/>
+              <w:ind w:firstLine="0"/>
+            </w:pPr>
+            <w:r/>
+            <w:r>
+              <w:rPr>
+                <w:b/>
+                <w:sz w:val="19"/>
+              </w:rPr>
+              <w:t>Design</w:t>
+            </w:r>
+          </w:p>
+        </w:tc>
+        <w:tc>
+          <w:tcPr>
+            <w:tcW w:type="dxa" w:w="2520"/>
+            <w:shd w:val="clear" w:color="auto" w:fill="CDE2FB"/>
+          </w:tcPr>
+          <w:p>
+            <w:pPr>
+              <w:spacing w:line="240" w:lineRule="auto"/>
+              <w:ind w:firstLine="0"/>
+            </w:pPr>
+            <w:r/>
+            <w:r>
+              <w:rPr>
+                <w:b w:val="0"/>
+                <w:sz w:val="19"/>
+              </w:rPr>
+              <w:t>Multiple case study (2 firms, 4 managers)</w:t>
+            </w:r>
+          </w:p>
+        </w:tc>
+        <w:tc>
+          <w:tcPr>
+            <w:tcW w:type="dxa" w:w="2520"/>
+            <w:shd w:val="clear" w:color="auto" w:fill="FBD9C8"/>
+          </w:tcPr>
+          <w:p>
+            <w:pPr>
+              <w:spacing w:line="240" w:lineRule="auto"/>
+              <w:ind w:firstLine="0"/>
+            </w:pPr>
+            <w:r/>
+            <w:r>
+              <w:rPr>
+                <w:b w:val="0"/>
+                <w:sz w:val="19"/>
+              </w:rPr>
+              <w:t>Cross-sectional survey of SC and logistics managers</w:t>
+            </w:r>
+          </w:p>
+        </w:tc>
+        <w:tc>
+          <w:tcPr>
+            <w:tcW w:type="dxa" w:w="2592"/>
+            <w:shd w:val="clear" w:color="auto" w:fill="C9EFE0"/>
+          </w:tcPr>
+          <w:p>
+            <w:pPr>
+              <w:spacing w:line="240" w:lineRule="auto"/>
+              <w:ind w:firstLine="0"/>
+            </w:pPr>
+            <w:r/>
+            <w:r>
+              <w:rPr>
+                <w:b w:val="0"/>
+                <w:sz w:val="19"/>
+              </w:rPr>
+              <w:t>Multiphase sequential (3 phases)</w:t>
+            </w:r>
+          </w:p>
+        </w:tc>
+      </w:tr>
+      <w:tr>
+        <w:tc>
+          <w:tcPr>
+            <w:tcW w:type="dxa" w:w="1728"/>
+          </w:tcPr>
+          <w:p>
+            <w:pPr>
+              <w:spacing w:line="240" w:lineRule="auto"/>
+              <w:ind w:firstLine="0"/>
+            </w:pPr>
+            <w:r/>
+            <w:r>
+              <w:rPr>
+                <w:b/>
+                <w:sz w:val="19"/>
+              </w:rPr>
+              <w:t>Instruments</w:t>
+            </w:r>
+          </w:p>
+        </w:tc>
+        <w:tc>
+          <w:tcPr>
+            <w:tcW w:type="dxa" w:w="2520"/>
+            <w:shd w:val="clear" w:color="auto" w:fill="CDE2FB"/>
+          </w:tcPr>
+          <w:p>
+            <w:pPr>
+              <w:spacing w:line="240" w:lineRule="auto"/>
+              <w:ind w:firstLine="0"/>
+            </w:pPr>
+            <w:r/>
+            <w:r>
+              <w:rPr>
+                <w:b w:val="0"/>
+                <w:sz w:val="19"/>
+              </w:rPr>
+              <w:t>Interview protocol, company documents</w:t>
+            </w:r>
+          </w:p>
+        </w:tc>
+        <w:tc>
+          <w:tcPr>
+            <w:tcW w:type="dxa" w:w="2520"/>
+            <w:shd w:val="clear" w:color="auto" w:fill="FBD9C8"/>
+          </w:tcPr>
+          <w:p>
+            <w:pPr>
+              <w:spacing w:line="240" w:lineRule="auto"/>
+              <w:ind w:firstLine="0"/>
+            </w:pPr>
+            <w:r/>
+            <w:r>
+              <w:rPr>
+                <w:b w:val="0"/>
+                <w:sz w:val="19"/>
+              </w:rPr>
+              <w:t>Multi-item questionnaire scales</w:t>
+            </w:r>
+          </w:p>
+        </w:tc>
+        <w:tc>
+          <w:tcPr>
+            <w:tcW w:type="dxa" w:w="2592"/>
+            <w:shd w:val="clear" w:color="auto" w:fill="C9EFE0"/>
+          </w:tcPr>
+          <w:p>
+            <w:pPr>
+              <w:spacing w:line="240" w:lineRule="auto"/>
+              <w:ind w:firstLine="0"/>
+            </w:pPr>
+            <w:r/>
+            <w:r>
+              <w:rPr>
+                <w:b w:val="0"/>
+                <w:sz w:val="19"/>
+              </w:rPr>
+              <w:t>Focus group protocols, self-assessment tool</w:t>
+            </w:r>
+          </w:p>
+        </w:tc>
+      </w:tr>
+      <w:tr>
+        <w:tc>
+          <w:tcPr>
+            <w:tcW w:type="dxa" w:w="1728"/>
+          </w:tcPr>
+          <w:p>
+            <w:pPr>
+              <w:spacing w:line="240" w:lineRule="auto"/>
+              <w:ind w:firstLine="0"/>
+            </w:pPr>
+            <w:r/>
+            <w:r>
+              <w:rPr>
+                <w:b/>
+                <w:sz w:val="19"/>
+              </w:rPr>
+              <w:t>Analysis</w:t>
+            </w:r>
+          </w:p>
+        </w:tc>
+        <w:tc>
+          <w:tcPr>
+            <w:tcW w:type="dxa" w:w="2520"/>
+            <w:shd w:val="clear" w:color="auto" w:fill="CDE2FB"/>
+          </w:tcPr>
+          <w:p>
+            <w:pPr>
+              <w:spacing w:line="240" w:lineRule="auto"/>
+              <w:ind w:firstLine="0"/>
+            </w:pPr>
+            <w:r/>
+            <w:r>
+              <w:rPr>
+                <w:b w:val="0"/>
+                <w:sz w:val="19"/>
+              </w:rPr>
+              <w:t>Thematic analysis, triangulation</w:t>
+            </w:r>
+          </w:p>
+        </w:tc>
+        <w:tc>
+          <w:tcPr>
+            <w:tcW w:type="dxa" w:w="2520"/>
+            <w:shd w:val="clear" w:color="auto" w:fill="FBD9C8"/>
+          </w:tcPr>
+          <w:p>
+            <w:pPr>
+              <w:spacing w:line="240" w:lineRule="auto"/>
+              <w:ind w:firstLine="0"/>
+            </w:pPr>
+            <w:r/>
+            <w:r>
+              <w:rPr>
+                <w:b w:val="0"/>
+                <w:sz w:val="19"/>
+              </w:rPr>
+              <w:t>Structural equation modeling</w:t>
+            </w:r>
+          </w:p>
+        </w:tc>
+        <w:tc>
+          <w:tcPr>
+            <w:tcW w:type="dxa" w:w="2592"/>
+            <w:shd w:val="clear" w:color="auto" w:fill="C9EFE0"/>
+          </w:tcPr>
+          <w:p>
+            <w:pPr>
+              <w:spacing w:line="240" w:lineRule="auto"/>
+              <w:ind w:firstLine="0"/>
+            </w:pPr>
+            <w:r/>
+            <w:r>
+              <w:rPr>
+                <w:b w:val="0"/>
+                <w:sz w:val="19"/>
+              </w:rPr>
+              <w:t>Coding, correlations, triangulation</w:t>
+            </w:r>
+          </w:p>
+        </w:tc>
+      </w:tr>
+      <w:tr>
+        <w:tc>
+          <w:tcPr>
+            <w:tcW w:type="dxa" w:w="1728"/>
+          </w:tcPr>
+          <w:p>
+            <w:pPr>
+              <w:spacing w:line="240" w:lineRule="auto"/>
+              <w:ind w:firstLine="0"/>
+            </w:pPr>
+            <w:r/>
+            <w:r>
+              <w:rPr>
+                <w:b/>
+                <w:sz w:val="19"/>
+              </w:rPr>
+              <w:t>Key findings</w:t>
+            </w:r>
+          </w:p>
+        </w:tc>
+        <w:tc>
+          <w:tcPr>
+            <w:tcW w:type="dxa" w:w="2520"/>
+            <w:shd w:val="clear" w:color="auto" w:fill="CDE2FB"/>
+          </w:tcPr>
+          <w:p>
+            <w:pPr>
+              <w:spacing w:line="240" w:lineRule="auto"/>
+              <w:ind w:firstLine="0"/>
+            </w:pPr>
+            <w:r/>
+            <w:r>
+              <w:rPr>
+                <w:b w:val="0"/>
+                <w:sz w:val="19"/>
+              </w:rPr>
+              <w:t>Collaboration, IT and risk, multiple suppliers</w:t>
+            </w:r>
+          </w:p>
+        </w:tc>
+        <w:tc>
+          <w:tcPr>
+            <w:tcW w:type="dxa" w:w="2520"/>
+            <w:shd w:val="clear" w:color="auto" w:fill="FBD9C8"/>
+          </w:tcPr>
+          <w:p>
+            <w:pPr>
+              <w:spacing w:line="240" w:lineRule="auto"/>
+              <w:ind w:firstLine="0"/>
+            </w:pPr>
+            <w:r/>
+            <w:r>
+              <w:rPr>
+                <w:b w:val="0"/>
+                <w:sz w:val="19"/>
+              </w:rPr>
+              <w:t>Capabilities link orientations to resilience and value</w:t>
+            </w:r>
+          </w:p>
+        </w:tc>
+        <w:tc>
+          <w:tcPr>
+            <w:tcW w:type="dxa" w:w="2592"/>
+            <w:shd w:val="clear" w:color="auto" w:fill="C9EFE0"/>
+          </w:tcPr>
+          <w:p>
+            <w:pPr>
+              <w:spacing w:line="240" w:lineRule="auto"/>
+              <w:ind w:firstLine="0"/>
+            </w:pPr>
+            <w:r/>
+            <w:r>
+              <w:rPr>
+                <w:b w:val="0"/>
+                <w:sz w:val="19"/>
+              </w:rPr>
+              <w:t>7 vulnerability and 14 capability factors; 311 linkages</w:t>
+            </w:r>
+          </w:p>
+        </w:tc>
+      </w:tr>
+      <w:tr>
+        <w:tc>
+          <w:tcPr>
+            <w:tcW w:type="dxa" w:w="1728"/>
+          </w:tcPr>
+          <w:p>
+            <w:pPr>
+              <w:spacing w:line="240" w:lineRule="auto"/>
+              <w:ind w:firstLine="0"/>
+            </w:pPr>
+            <w:r/>
+            <w:r>
+              <w:rPr>
+                <w:b/>
+                <w:sz w:val="19"/>
+              </w:rPr>
+              <w:t>Ethics / legal</w:t>
+            </w:r>
+          </w:p>
+        </w:tc>
+        <w:tc>
+          <w:tcPr>
+            <w:tcW w:type="dxa" w:w="2520"/>
+            <w:shd w:val="clear" w:color="auto" w:fill="CDE2FB"/>
+          </w:tcPr>
+          <w:p>
+            <w:pPr>
+              <w:spacing w:line="240" w:lineRule="auto"/>
+              <w:ind w:firstLine="0"/>
+            </w:pPr>
+            <w:r/>
+            <w:r>
+              <w:rPr>
+                <w:b w:val="0"/>
+                <w:sz w:val="19"/>
+              </w:rPr>
+              <w:t>IRB, consent, confidentiality, NDAs</w:t>
+            </w:r>
+          </w:p>
+        </w:tc>
+        <w:tc>
+          <w:tcPr>
+            <w:tcW w:type="dxa" w:w="2520"/>
+            <w:shd w:val="clear" w:color="auto" w:fill="FBD9C8"/>
+          </w:tcPr>
+          <w:p>
+            <w:pPr>
+              <w:spacing w:line="240" w:lineRule="auto"/>
+              <w:ind w:firstLine="0"/>
+            </w:pPr>
+            <w:r/>
+            <w:r>
+              <w:rPr>
+                <w:b w:val="0"/>
+                <w:sz w:val="19"/>
+              </w:rPr>
+              <w:t>Anonymity, method bias, data privacy</w:t>
+            </w:r>
+          </w:p>
+        </w:tc>
+        <w:tc>
+          <w:tcPr>
+            <w:tcW w:type="dxa" w:w="2592"/>
+            <w:shd w:val="clear" w:color="auto" w:fill="C9EFE0"/>
+          </w:tcPr>
+          <w:p>
+            <w:pPr>
+              <w:spacing w:line="240" w:lineRule="auto"/>
+              <w:ind w:firstLine="0"/>
+            </w:pPr>
+            <w:r/>
+            <w:r>
+              <w:rPr>
+                <w:b w:val="0"/>
+                <w:sz w:val="19"/>
+              </w:rPr>
+              <w:t>Firm confidentiality, conflicts of interest, IP</w:t>
+            </w:r>
+          </w:p>
+        </w:tc>
+      </w:tr>
+    </w:tbl>
+    <w:p>
+      <w:pPr>
+        <w:spacing w:line="480" w:lineRule="auto"/>
+      </w:pPr>
+      <w:r>
+        <w:rPr>
+          <w:i/>
+        </w:rPr>
+        <w:t xml:space="preserve">Note. </w:t>
+      </w:r>
+      <w:r>
+        <w:t>Compiled by the author from Benton (2019), Ponomarov (2012), and Pettit (2008). Column colors match Figure 1: blue = qualitative, orange = quantitative, green = mixed methods. RQ = research question; SC = supply chain; NDA = nondisclosure agreement; IP = intellectual property.</w:t>
+      </w:r>
+    </w:p>
+    <w:p>
+      <w:pPr>
+        <w:keepNext/>
+        <w:pageBreakBefore/>
+      </w:pPr>
+      <w:r>
+        <w:rPr>
+          <w:b/>
+          <w:i w:val="0"/>
+        </w:rPr>
+        <w:t>Figure 1</w:t>
+      </w:r>
+    </w:p>
+    <w:p>
+      <w:pPr>
+        <w:keepNext/>
+      </w:pPr>
+      <w:r>
+        <w:rPr>
+          <w:b w:val="0"/>
+          <w:i/>
+        </w:rPr>
+        <w:t>Research Lifecycle Stages in the Qualitative, Quantitative, and Mixed Methods Dissertations</w:t>
+      </w:r>
+    </w:p>
+    <w:p>
+      <w:pPr>
+        <w:keepNext/>
+        <w:spacing w:line="240" w:lineRule="auto"/>
+        <w:jc w:val="center"/>
+      </w:pPr>
+      <w:r>
+        <w:drawing>
+          <wp:inline xmlns:a="http://schemas.openxmlformats.org/drawingml/2006/main" xmlns:pic="http://schemas.openxmlformats.org/drawingml/2006/picture">
+            <wp:extent cx="5943600" cy="2861848"/>
+            <wp:docPr id="1" name="Picture 1"/>
+            <wp:cNvGraphicFramePr>
+              <a:graphicFrameLocks noChangeAspect="1"/>
+            </wp:cNvGraphicFramePr>
+            <a:graphic>
+              <a:graphicData uri="http://schemas.openxmlformats.org/drawingml/2006/picture">
+                <pic:pic>
+                  <pic:nvPicPr>
+                    <pic:cNvPr id="0" name="fig1_lifecycle.png"/>
+                    <pic:cNvPicPr/>
+                  </pic:nvPicPr>
+                  <pic:blipFill>
+                    <a:blip r:embed="rId10"/>
+                    <a:stretch>
+                      <a:fillRect/>
+                    </a:stretch>
+                  </pic:blipFill>
+                  <pic:spPr>
+                    <a:xfrm>
+                      <a:off x="0" y="0"/>
+                      <a:ext cx="5943600" cy="2861848"/>
+                    </a:xfrm>
+                    <a:prstGeom prst="rect"/>
+                  </pic:spPr>
+                </pic:pic>
+              </a:graphicData>
+            </a:graphic>
+          </wp:inline>
+        </w:drawing>
+      </w:r>
+    </w:p>
+    <w:p>
+      <w:pPr>
+        <w:spacing w:line="480" w:lineRule="auto"/>
+      </w:pPr>
+      <w:r>
+        <w:rPr>
+          <w:i/>
+        </w:rPr>
+        <w:t xml:space="preserve">Note. </w:t>
+      </w:r>
+      <w:r>
+        <w:t>Each row traces one dissertation from problem to findings. Compiled from Benton (2019), Ponomarov (2012), and Pettit (2008).</w:t>
+      </w:r>
+    </w:p>
+    <w:p>
+      <w:pPr>
+        <w:keepNext/>
+        <w:pageBreakBefore/>
+      </w:pPr>
+      <w:r>
+        <w:rPr>
+          <w:b/>
+          <w:i w:val="0"/>
+        </w:rPr>
+        <w:t>Figure 2</w:t>
+      </w:r>
+    </w:p>
+    <w:p>
+      <w:pPr>
+        <w:keepNext/>
+      </w:pPr>
+      <w:r>
+        <w:rPr>
+          <w:b w:val="0"/>
+          <w:i/>
+        </w:rPr>
+        <w:t>Structure of Pettit's (2008) Supply Chain Resilience Framework</w:t>
+      </w:r>
+    </w:p>
+    <w:p>
+      <w:pPr>
+        <w:keepNext/>
+        <w:spacing w:line="240" w:lineRule="auto"/>
+        <w:jc w:val="center"/>
+      </w:pPr>
+      <w:r>
+        <w:drawing>
+          <wp:inline xmlns:a="http://schemas.openxmlformats.org/drawingml/2006/main" xmlns:pic="http://schemas.openxmlformats.org/drawingml/2006/picture">
+            <wp:extent cx="5486400" cy="2846223"/>
+            <wp:docPr id="2" name="Picture 2"/>
+            <wp:cNvGraphicFramePr>
+              <a:graphicFrameLocks noChangeAspect="1"/>
+            </wp:cNvGraphicFramePr>
+            <a:graphic>
+              <a:graphicData uri="http://schemas.openxmlformats.org/drawingml/2006/picture">
+                <pic:pic>
+                  <pic:nvPicPr>
+                    <pic:cNvPr id="0" name="fig2_pettit.png"/>
+                    <pic:cNvPicPr/>
+                  </pic:nvPicPr>
+                  <pic:blipFill>
+                    <a:blip r:embed="rId11"/>
+                    <a:stretch>
+                      <a:fillRect/>
+                    </a:stretch>
+                  </pic:blipFill>
+                  <pic:spPr>
+                    <a:xfrm>
+                      <a:off x="0" y="0"/>
+                      <a:ext cx="5486400" cy="2846223"/>
+                    </a:xfrm>
+                    <a:prstGeom prst="rect"/>
+                  </pic:spPr>
+                </pic:pic>
+              </a:graphicData>
+            </a:graphic>
+          </wp:inline>
+        </w:drawing>
+      </w:r>
+    </w:p>
+    <w:p>
+      <w:pPr>
+        <w:spacing w:line="480" w:lineRule="auto"/>
+      </w:pPr>
+      <w:r>
+        <w:rPr>
+          <w:i/>
+        </w:rPr>
+        <w:t xml:space="preserve">Note. </w:t>
+      </w:r>
+      <w:r>
+        <w:t>Counts of resilience factors and their underlying attributes. Triangulation of the two dimensions produced 311 vulnerability–capability linkages. Data from Pettit (2008).</w:t>
+      </w:r>
+    </w:p>
+    <w:p>
+      <w:pPr>
+        <w:keepNext/>
+        <w:pageBreakBefore/>
+      </w:pPr>
+      <w:r>
+        <w:rPr>
+          <w:b/>
+          <w:i w:val="0"/>
+        </w:rPr>
+        <w:t>Figure 3</w:t>
+      </w:r>
+    </w:p>
+    <w:p>
+      <w:pPr>
+        <w:keepNext/>
+      </w:pPr>
+      <w:r>
+        <w:rPr>
+          <w:b w:val="0"/>
+          <w:i/>
+        </w:rPr>
+        <w:t>Concurrent Data Strands and Survey Results in a Published Mixed Methods Supply Chain Study</w:t>
+      </w:r>
+    </w:p>
+    <w:p>
+      <w:pPr>
+        <w:keepNext/>
+        <w:spacing w:line="240" w:lineRule="auto"/>
+        <w:jc w:val="center"/>
+      </w:pPr>
+      <w:r>
+        <w:drawing>
+          <wp:inline xmlns:a="http://schemas.openxmlformats.org/drawingml/2006/main" xmlns:pic="http://schemas.openxmlformats.org/drawingml/2006/picture">
+            <wp:extent cx="5943600" cy="2271749"/>
+            <wp:docPr id="3" name="Picture 3"/>
+            <wp:cNvGraphicFramePr>
+              <a:graphicFrameLocks noChangeAspect="1"/>
+            </wp:cNvGraphicFramePr>
+            <a:graphic>
+              <a:graphicData uri="http://schemas.openxmlformats.org/drawingml/2006/picture">
+                <pic:pic>
+                  <pic:nvPicPr>
+                    <pic:cNvPr id="0" name="fig3_asamoah.png"/>
+                    <pic:cNvPicPr/>
+                  </pic:nvPicPr>
+                  <pic:blipFill>
+                    <a:blip r:embed="rId12"/>
+                    <a:stretch>
+                      <a:fillRect/>
+                    </a:stretch>
+                  </pic:blipFill>
+                  <pic:spPr>
+                    <a:xfrm>
+                      <a:off x="0" y="0"/>
+                      <a:ext cx="5943600" cy="2271749"/>
+                    </a:xfrm>
+                    <a:prstGeom prst="rect"/>
+                  </pic:spPr>
+                </pic:pic>
+              </a:graphicData>
+            </a:graphic>
+          </wp:inline>
+        </w:drawing>
+      </w:r>
+    </w:p>
+    <w:p>
+      <w:pPr>
+        <w:spacing w:line="480" w:lineRule="auto"/>
+      </w:pPr>
+      <w:r>
+        <w:rPr>
+          <w:i/>
+        </w:rPr>
+        <w:t xml:space="preserve">Note. </w:t>
+      </w:r>
+      <w:r>
+        <w:t>Panel A shows the three data sources collected concurrently across 12 facilities; Panel B shows the share of survey participants scoring at least 70% on cold chain knowledge and attitudes. Data from Asamoah et al. (2021).</w:t>
+      </w:r>
+    </w:p>
+    <w:p>
+      <w:pPr>
+        <w:pageBreakBefore/>
+        <w:jc w:val="center"/>
+      </w:pPr>
+      <w:r>
+        <w:rPr>
+          <w:b/>
+          <w:i w:val="0"/>
+        </w:rPr>
+        <w:t>Appendix</w:t>
+      </w:r>
+    </w:p>
+    <w:p>
+      <w:pPr>
+        <w:keepNext/>
+        <w:jc w:val="center"/>
+      </w:pPr>
+      <w:r>
+        <w:rPr>
+          <w:b/>
+          <w:i w:val="0"/>
+        </w:rPr>
+        <w:t>Material Shortage Risk-Scoring and Mitigation Selection Algorithm</w:t>
+      </w:r>
+    </w:p>
+    <w:p>
+      <w:pPr>
+        <w:ind w:firstLine="720"/>
+      </w:pPr>
+      <w:r>
+        <w:rPr>
+          <w:b w:val="0"/>
+          <w:i w:val="0"/>
+        </w:rPr>
+        <w:t>Algorithm A1 operationalizes the proposed framework. It combines Pettit's (2008) vulnerability lens (coverage, lead time, source concentration, and supplier utilization) with the buffering levers that Kouvelis et al. (2023) identify (inventory, time buffers, and supplier flexibility) and the mitigation themes in Benton (2019). Figure A1 summarizes the steps, and Table A1 and Figure A2 apply the algorithm to illustrative data. The weights are starting assumptions to be calibrated with interview and performance data collected in the proposed study.</w:t>
+      </w:r>
+    </w:p>
+    <w:p>
+      <w:pPr>
+        <w:keepNext/>
+      </w:pPr>
+      <w:r>
+        <w:rPr>
+          <w:b/>
+          <w:i w:val="0"/>
+        </w:rPr>
+        <w:t>Algorithm A1</w:t>
+      </w:r>
+    </w:p>
+    <w:p>
+      <w:pPr>
+        <w:keepNext/>
+      </w:pPr>
+      <w:r>
+        <w:rPr>
+          <w:b w:val="0"/>
+          <w:i/>
+        </w:rPr>
+        <w:t>Material Shortage Risk Scoring (MSRS) for Ramp-Up Planning</w:t>
+      </w:r>
+    </w:p>
+    <w:tbl>
+      <w:tblPr>
+        <w:tblW w:type="auto" w:w="0"/>
+        <w:jc w:val="center"/>
+        <w:tblLook w:firstColumn="1" w:firstRow="1" w:lastColumn="0" w:lastRow="0" w:noHBand="0" w:noVBand="1" w:val="04A0"/>
+      </w:tblPr>
+      <w:tblGrid>
+        <w:gridCol w:w="9360"/>
+      </w:tblGrid>
+      <w:tr>
+        <w:tc>
+          <w:tcPr>
+            <w:tcW w:type="dxa" w:w="9360"/>
+            <w:shd w:val="clear" w:color="auto" w:fill="F3F7FD"/>
+          </w:tcPr>
+          <w:p>
+            <w:pPr>
+              <w:spacing w:line="240" w:lineRule="auto"/>
+              <w:ind w:firstLine="0"/>
+            </w:pPr>
+            <w:r/>
+            <w:r>
+              <w:rPr>
+                <w:rFonts w:ascii="Courier New" w:hAnsi="Courier New" w:eastAsia="Courier New"/>
+                <w:sz w:val="17"/>
+              </w:rPr>
+              <w:t>Input:  for each critical part i in the ramp-up bill of materials:</w:t>
+            </w:r>
+          </w:p>
+          <w:p>
+            <w:pPr>
+              <w:spacing w:line="240" w:lineRule="auto"/>
+              <w:ind w:firstLine="0"/>
+            </w:pPr>
+            <w:r>
+              <w:rPr>
+                <w:rFonts w:ascii="Courier New" w:hAnsi="Courier New" w:eastAsia="Courier New"/>
+                <w:sz w:val="17"/>
+              </w:rPr>
+              <w:t xml:space="preserve">        D_i  ramp-up demand over horizon H (weeks)</w:t>
+            </w:r>
+          </w:p>
+          <w:p>
+            <w:pPr>
+              <w:spacing w:line="240" w:lineRule="auto"/>
+              <w:ind w:firstLine="0"/>
+            </w:pPr>
+            <w:r>
+              <w:rPr>
+                <w:rFonts w:ascii="Courier New" w:hAnsi="Courier New" w:eastAsia="Courier New"/>
+                <w:sz w:val="17"/>
+              </w:rPr>
+              <w:t xml:space="preserve">        I_i  on-hand inventory      S_i  confirmed open supply (POs)</w:t>
+            </w:r>
+          </w:p>
+          <w:p>
+            <w:pPr>
+              <w:spacing w:line="240" w:lineRule="auto"/>
+              <w:ind w:firstLine="0"/>
+            </w:pPr>
+            <w:r>
+              <w:rPr>
+                <w:rFonts w:ascii="Courier New" w:hAnsi="Courier New" w:eastAsia="Courier New"/>
+                <w:sz w:val="17"/>
+              </w:rPr>
+              <w:t xml:space="preserve">        SS_i strategic safety stock L_i  supplier lead time (weeks)</w:t>
+            </w:r>
+          </w:p>
+          <w:p>
+            <w:pPr>
+              <w:spacing w:line="240" w:lineRule="auto"/>
+              <w:ind w:firstLine="0"/>
+            </w:pPr>
+            <w:r>
+              <w:rPr>
+                <w:rFonts w:ascii="Courier New" w:hAnsi="Courier New" w:eastAsia="Courier New"/>
+                <w:sz w:val="17"/>
+              </w:rPr>
+              <w:t xml:space="preserve">        n_i  qualified sources      u_i  supplier capacity utilization (0-1)</w:t>
+            </w:r>
+          </w:p>
+          <w:p>
+            <w:pPr>
+              <w:spacing w:line="240" w:lineRule="auto"/>
+              <w:ind w:firstLine="0"/>
+            </w:pPr>
+            <w:r>
+              <w:rPr>
+                <w:rFonts w:ascii="Courier New" w:hAnsi="Courier New" w:eastAsia="Courier New"/>
+                <w:sz w:val="17"/>
+              </w:rPr>
+              <w:t xml:space="preserve">        Weights w = (0.35, 0.25, 0.20, 0.20)</w:t>
+            </w:r>
+          </w:p>
+          <w:p>
+            <w:pPr>
+              <w:spacing w:line="240" w:lineRule="auto"/>
+              <w:ind w:firstLine="0"/>
+            </w:pPr>
+            <w:r>
+              <w:rPr>
+                <w:rFonts w:ascii="Courier New" w:hAnsi="Courier New" w:eastAsia="Courier New"/>
+                <w:sz w:val="17"/>
+              </w:rPr>
+              <w:t>Output: risk score R_i, status, and mitigation action for every part</w:t>
+            </w:r>
+          </w:p>
+          <w:p>
+            <w:pPr>
+              <w:spacing w:line="240" w:lineRule="auto"/>
+              <w:ind w:firstLine="0"/>
+            </w:pPr>
+            <w:r>
+              <w:rPr>
+                <w:rFonts w:ascii="Courier New" w:hAnsi="Courier New" w:eastAsia="Courier New"/>
+                <w:sz w:val="17"/>
+              </w:rPr>
+            </w:r>
+          </w:p>
+          <w:p>
+            <w:pPr>
+              <w:spacing w:line="240" w:lineRule="auto"/>
+              <w:ind w:firstLine="0"/>
+            </w:pPr>
+            <w:r>
+              <w:rPr>
+                <w:rFonts w:ascii="Courier New" w:hAnsi="Courier New" w:eastAsia="Courier New"/>
+                <w:sz w:val="17"/>
+              </w:rPr>
+              <w:t xml:space="preserve"> 1  for each part i do</w:t>
+            </w:r>
+          </w:p>
+          <w:p>
+            <w:pPr>
+              <w:spacing w:line="240" w:lineRule="auto"/>
+              <w:ind w:firstLine="0"/>
+            </w:pPr>
+            <w:r>
+              <w:rPr>
+                <w:rFonts w:ascii="Courier New" w:hAnsi="Courier New" w:eastAsia="Courier New"/>
+                <w:sz w:val="17"/>
+              </w:rPr>
+              <w:t xml:space="preserve"> 2      C_i &lt;- (I_i + S_i) / (D_i + SS_i)                 // projected coverage</w:t>
+            </w:r>
+          </w:p>
+          <w:p>
+            <w:pPr>
+              <w:spacing w:line="240" w:lineRule="auto"/>
+              <w:ind w:firstLine="0"/>
+            </w:pPr>
+            <w:r>
+              <w:rPr>
+                <w:rFonts w:ascii="Courier New" w:hAnsi="Courier New" w:eastAsia="Courier New"/>
+                <w:sz w:val="17"/>
+              </w:rPr>
+              <w:t xml:space="preserve"> 3      G_i &lt;- max(0, D_i + SS_i - I_i - S_i)             // shortage gap (units)</w:t>
+            </w:r>
+          </w:p>
+          <w:p>
+            <w:pPr>
+              <w:spacing w:line="240" w:lineRule="auto"/>
+              <w:ind w:firstLine="0"/>
+            </w:pPr>
+            <w:r>
+              <w:rPr>
+                <w:rFonts w:ascii="Courier New" w:hAnsi="Courier New" w:eastAsia="Courier New"/>
+                <w:sz w:val="17"/>
+              </w:rPr>
+              <w:t xml:space="preserve"> 4      V_i &lt;- w1(1 - min(C_i,1)) + w2 min(L_i/H,1)</w:t>
+            </w:r>
+          </w:p>
+          <w:p>
+            <w:pPr>
+              <w:spacing w:line="240" w:lineRule="auto"/>
+              <w:ind w:firstLine="0"/>
+            </w:pPr>
+            <w:r>
+              <w:rPr>
+                <w:rFonts w:ascii="Courier New" w:hAnsi="Courier New" w:eastAsia="Courier New"/>
+                <w:sz w:val="17"/>
+              </w:rPr>
+              <w:t xml:space="preserve">              + w3(1/n_i) + w4 u_i                        // vulnerability index</w:t>
+            </w:r>
+          </w:p>
+          <w:p>
+            <w:pPr>
+              <w:spacing w:line="240" w:lineRule="auto"/>
+              <w:ind w:firstLine="0"/>
+            </w:pPr>
+            <w:r>
+              <w:rPr>
+                <w:rFonts w:ascii="Courier New" w:hAnsi="Courier New" w:eastAsia="Courier New"/>
+                <w:sz w:val="17"/>
+              </w:rPr>
+              <w:t xml:space="preserve"> 5      R_i &lt;- round(100 * V_i)</w:t>
+            </w:r>
+          </w:p>
+          <w:p>
+            <w:pPr>
+              <w:spacing w:line="240" w:lineRule="auto"/>
+              <w:ind w:firstLine="0"/>
+            </w:pPr>
+            <w:r>
+              <w:rPr>
+                <w:rFonts w:ascii="Courier New" w:hAnsi="Courier New" w:eastAsia="Courier New"/>
+                <w:sz w:val="17"/>
+              </w:rPr>
+              <w:t xml:space="preserve"> 6      if   R_i &gt;= 70 then status &lt;- CRITICAL</w:t>
+            </w:r>
+          </w:p>
+          <w:p>
+            <w:pPr>
+              <w:spacing w:line="240" w:lineRule="auto"/>
+              <w:ind w:firstLine="0"/>
+            </w:pPr>
+            <w:r>
+              <w:rPr>
+                <w:rFonts w:ascii="Courier New" w:hAnsi="Courier New" w:eastAsia="Courier New"/>
+                <w:sz w:val="17"/>
+              </w:rPr>
+              <w:t xml:space="preserve"> 7           action &lt;- reserve capacity, expedite, qualify alternate source</w:t>
+            </w:r>
+          </w:p>
+          <w:p>
+            <w:pPr>
+              <w:spacing w:line="240" w:lineRule="auto"/>
+              <w:ind w:firstLine="0"/>
+            </w:pPr>
+            <w:r>
+              <w:rPr>
+                <w:rFonts w:ascii="Courier New" w:hAnsi="Courier New" w:eastAsia="Courier New"/>
+                <w:sz w:val="17"/>
+              </w:rPr>
+              <w:t xml:space="preserve"> 8      elif R_i &gt;= 50 then status &lt;- SERIOUS</w:t>
+            </w:r>
+          </w:p>
+          <w:p>
+            <w:pPr>
+              <w:spacing w:line="240" w:lineRule="auto"/>
+              <w:ind w:firstLine="0"/>
+            </w:pPr>
+            <w:r>
+              <w:rPr>
+                <w:rFonts w:ascii="Courier New" w:hAnsi="Courier New" w:eastAsia="Courier New"/>
+                <w:sz w:val="17"/>
+              </w:rPr>
+              <w:t xml:space="preserve"> 9           action &lt;- multi-source, raise strategic safety stock</w:t>
+            </w:r>
+          </w:p>
+          <w:p>
+            <w:pPr>
+              <w:spacing w:line="240" w:lineRule="auto"/>
+              <w:ind w:firstLine="0"/>
+            </w:pPr>
+            <w:r>
+              <w:rPr>
+                <w:rFonts w:ascii="Courier New" w:hAnsi="Courier New" w:eastAsia="Courier New"/>
+                <w:sz w:val="17"/>
+              </w:rPr>
+              <w:t>10      elif R_i &gt;= 30 then status &lt;- WARNING</w:t>
+            </w:r>
+          </w:p>
+          <w:p>
+            <w:pPr>
+              <w:spacing w:line="240" w:lineRule="auto"/>
+              <w:ind w:firstLine="0"/>
+            </w:pPr>
+            <w:r>
+              <w:rPr>
+                <w:rFonts w:ascii="Courier New" w:hAnsi="Courier New" w:eastAsia="Courier New"/>
+                <w:sz w:val="17"/>
+              </w:rPr>
+              <w:t>11           action &lt;- weekly supplier capacity review, collaboration</w:t>
+            </w:r>
+          </w:p>
+          <w:p>
+            <w:pPr>
+              <w:spacing w:line="240" w:lineRule="auto"/>
+              <w:ind w:firstLine="0"/>
+            </w:pPr>
+            <w:r>
+              <w:rPr>
+                <w:rFonts w:ascii="Courier New" w:hAnsi="Courier New" w:eastAsia="Courier New"/>
+                <w:sz w:val="17"/>
+              </w:rPr>
+              <w:t>12      else status &lt;- GOOD;  action &lt;- maintain lean / JIT replenishment</w:t>
+            </w:r>
+          </w:p>
+          <w:p>
+            <w:pPr>
+              <w:spacing w:line="240" w:lineRule="auto"/>
+              <w:ind w:firstLine="0"/>
+            </w:pPr>
+            <w:r>
+              <w:rPr>
+                <w:rFonts w:ascii="Courier New" w:hAnsi="Courier New" w:eastAsia="Courier New"/>
+                <w:sz w:val="17"/>
+              </w:rPr>
+              <w:t>13      if R_i - R_i(previous cycle) &gt;= 10 then raise EARLY WARNING</w:t>
+            </w:r>
+          </w:p>
+          <w:p>
+            <w:pPr>
+              <w:spacing w:line="240" w:lineRule="auto"/>
+              <w:ind w:firstLine="0"/>
+            </w:pPr>
+            <w:r>
+              <w:rPr>
+                <w:rFonts w:ascii="Courier New" w:hAnsi="Courier New" w:eastAsia="Courier New"/>
+                <w:sz w:val="17"/>
+              </w:rPr>
+              <w:t>14  end for</w:t>
+            </w:r>
+          </w:p>
+          <w:p>
+            <w:pPr>
+              <w:spacing w:line="240" w:lineRule="auto"/>
+              <w:ind w:firstLine="0"/>
+            </w:pPr>
+            <w:r>
+              <w:rPr>
+                <w:rFonts w:ascii="Courier New" w:hAnsi="Courier New" w:eastAsia="Courier New"/>
+                <w:sz w:val="17"/>
+              </w:rPr>
+              <w:t>15  sort parts by R_i (descending) and escalate CRITICAL parts to the</w:t>
+            </w:r>
+          </w:p>
+          <w:p>
+            <w:pPr>
+              <w:spacing w:line="240" w:lineRule="auto"/>
+              <w:ind w:firstLine="0"/>
+            </w:pPr>
+            <w:r>
+              <w:rPr>
+                <w:rFonts w:ascii="Courier New" w:hAnsi="Courier New" w:eastAsia="Courier New"/>
+                <w:sz w:val="17"/>
+              </w:rPr>
+              <w:t xml:space="preserve">    cross-functional ramp-up review</w:t>
+            </w:r>
+          </w:p>
+          <w:p>
+            <w:pPr>
+              <w:spacing w:line="240" w:lineRule="auto"/>
+              <w:ind w:firstLine="0"/>
+            </w:pPr>
+            <w:r>
+              <w:rPr>
+                <w:rFonts w:ascii="Courier New" w:hAnsi="Courier New" w:eastAsia="Courier New"/>
+                <w:sz w:val="17"/>
+              </w:rPr>
+              <w:t>16  repeat every planning cycle with refreshed demand and supplier data</w:t>
+            </w:r>
+          </w:p>
+        </w:tc>
+      </w:tr>
+    </w:tbl>
+    <w:p>
+      <w:pPr>
+        <w:spacing w:line="480" w:lineRule="auto"/>
+      </w:pPr>
+      <w:r>
+        <w:rPr>
+          <w:i/>
+        </w:rPr>
+        <w:t xml:space="preserve">Note. </w:t>
+      </w:r>
+      <w:r>
+        <w:t>PO = purchase order; JIT = just-in-time. Developed by the author for the proposed study.</w:t>
+      </w:r>
+    </w:p>
+    <w:p>
+      <w:pPr>
+        <w:keepNext/>
+        <w:pageBreakBefore/>
+      </w:pPr>
+      <w:r>
+        <w:rPr>
+          <w:b/>
+          <w:i w:val="0"/>
+        </w:rPr>
+        <w:t>Figure A1</w:t>
+      </w:r>
+    </w:p>
+    <w:p>
+      <w:pPr>
+        <w:keepNext/>
+      </w:pPr>
+      <w:r>
+        <w:rPr>
+          <w:b w:val="0"/>
+          <w:i/>
+        </w:rPr>
+        <w:t>Flow of the Material Shortage Risk-Scoring Algorithm</w:t>
+      </w:r>
+    </w:p>
+    <w:p>
+      <w:pPr>
+        <w:keepNext/>
+        <w:spacing w:line="240" w:lineRule="auto"/>
+        <w:jc w:val="center"/>
+      </w:pPr>
+      <w:r>
+        <w:drawing>
+          <wp:inline xmlns:a="http://schemas.openxmlformats.org/drawingml/2006/main" xmlns:pic="http://schemas.openxmlformats.org/drawingml/2006/picture">
+            <wp:extent cx="5760720" cy="3436329"/>
+            <wp:docPr id="4" name="Picture 4"/>
+            <wp:cNvGraphicFramePr>
+              <a:graphicFrameLocks noChangeAspect="1"/>
+            </wp:cNvGraphicFramePr>
+            <a:graphic>
+              <a:graphicData uri="http://schemas.openxmlformats.org/drawingml/2006/picture">
+                <pic:pic>
+                  <pic:nvPicPr>
+                    <pic:cNvPr id="0" name="fig5_flow.png"/>
+                    <pic:cNvPicPr/>
+                  </pic:nvPicPr>
+                  <pic:blipFill>
+                    <a:blip r:embed="rId13"/>
+                    <a:stretch>
+                      <a:fillRect/>
+                    </a:stretch>
+                  </pic:blipFill>
+                  <pic:spPr>
+                    <a:xfrm>
+                      <a:off x="0" y="0"/>
+                      <a:ext cx="5760720" cy="3436329"/>
+                    </a:xfrm>
+                    <a:prstGeom prst="rect"/>
+                  </pic:spPr>
+                </pic:pic>
+              </a:graphicData>
+            </a:graphic>
+          </wp:inline>
+        </w:drawing>
+      </w:r>
+    </w:p>
+    <w:p>
+      <w:pPr>
+        <w:spacing w:line="480" w:lineRule="auto"/>
+      </w:pPr>
+      <w:r>
+        <w:rPr>
+          <w:i/>
+        </w:rPr>
+        <w:t xml:space="preserve">Note. </w:t>
+      </w:r>
+      <w:r>
+        <w:t>Blue steps prepare data, orange steps score and classify risk, and green steps act and monitor. C = coverage; G = gap; L/H = lead time relative to the planning horizon; n = qualified sources; u = supplier utilization.</w:t>
+      </w:r>
+    </w:p>
+    <w:p>
+      <w:pPr>
+        <w:keepNext/>
+        <w:pageBreakBefore/>
+      </w:pPr>
+      <w:r>
+        <w:rPr>
+          <w:b/>
+          <w:i w:val="0"/>
+        </w:rPr>
+        <w:t>Table A1</w:t>
+      </w:r>
+    </w:p>
+    <w:p>
+      <w:pPr>
+        <w:keepNext/>
+      </w:pPr>
+      <w:r>
+        <w:rPr>
+          <w:b w:val="0"/>
+          <w:i/>
+        </w:rPr>
+        <w:t>Illustrative Application of Algorithm A1 to Six Ramp-Up Parts (Hypothetical Data)</w:t>
+      </w:r>
+    </w:p>
+    <w:tbl>
+      <w:tblPr>
+        <w:tblStyle w:val="TableGrid"/>
+        <w:tblW w:type="auto" w:w="0"/>
+        <w:jc w:val="center"/>
+        <w:tblLayout w:type="fixed"/>
+        <w:tblLook w:firstColumn="1" w:firstRow="1" w:lastColumn="0" w:lastRow="0" w:noHBand="0" w:noVBand="1" w:val="04A0"/>
+        <w:tblLayout w:type="fixed"/>
+      </w:tblPr>
+      <w:tblGrid>
+        <w:gridCol w:w="1368"/>
+        <w:gridCol w:w="576"/>
+        <w:gridCol w:w="547"/>
+        <w:gridCol w:w="547"/>
+        <w:gridCol w:w="475"/>
+        <w:gridCol w:w="403"/>
+        <w:gridCol w:w="360"/>
+        <w:gridCol w:w="547"/>
+        <w:gridCol w:w="547"/>
+        <w:gridCol w:w="518"/>
+        <w:gridCol w:w="475"/>
+        <w:gridCol w:w="950"/>
+        <w:gridCol w:w="2088"/>
+      </w:tblGrid>
+      <w:tr>
+        <w:tc>
+          <w:tcPr>
+            <w:tcW w:type="dxa" w:w="1368"/>
+            <w:shd w:val="clear" w:color="auto" w:fill="EB6834"/>
+          </w:tcPr>
+          <w:p>
+            <w:pPr>
+              <w:spacing w:line="240" w:lineRule="auto"/>
+              <w:ind w:firstLine="0"/>
+            </w:pPr>
+            <w:r/>
+            <w:r>
+              <w:rPr>
+                <w:b/>
+                <w:color w:val="FFFFFF"/>
+                <w:sz w:val="16"/>
+              </w:rPr>
+              <w:t>Part</w:t>
+            </w:r>
+          </w:p>
+        </w:tc>
+        <w:tc>
+          <w:tcPr>
+            <w:tcW w:type="dxa" w:w="576"/>
+            <w:shd w:val="clear" w:color="auto" w:fill="EB6834"/>
+          </w:tcPr>
+          <w:p>
+            <w:pPr>
+              <w:spacing w:line="240" w:lineRule="auto"/>
+              <w:ind w:firstLine="0"/>
+            </w:pPr>
+            <w:r/>
+            <w:r>
+              <w:rPr>
+                <w:b/>
+                <w:color w:val="FFFFFF"/>
+                <w:sz w:val="16"/>
+              </w:rPr>
+              <w:t>D</w:t>
+            </w:r>
+          </w:p>
+        </w:tc>
+        <w:tc>
+          <w:tcPr>
+            <w:tcW w:type="dxa" w:w="547"/>
+            <w:shd w:val="clear" w:color="auto" w:fill="EB6834"/>
+          </w:tcPr>
+          <w:p>
+            <w:pPr>
+              <w:spacing w:line="240" w:lineRule="auto"/>
+              <w:ind w:firstLine="0"/>
+            </w:pPr>
+            <w:r/>
+            <w:r>
+              <w:rPr>
+                <w:b/>
+                <w:color w:val="FFFFFF"/>
+                <w:sz w:val="16"/>
+              </w:rPr>
+              <w:t>I</w:t>
+            </w:r>
+          </w:p>
+        </w:tc>
+        <w:tc>
+          <w:tcPr>
+            <w:tcW w:type="dxa" w:w="547"/>
+            <w:shd w:val="clear" w:color="auto" w:fill="EB6834"/>
+          </w:tcPr>
+          <w:p>
+            <w:pPr>
+              <w:spacing w:line="240" w:lineRule="auto"/>
+              <w:ind w:firstLine="0"/>
+            </w:pPr>
+            <w:r/>
+            <w:r>
+              <w:rPr>
+                <w:b/>
+                <w:color w:val="FFFFFF"/>
+                <w:sz w:val="16"/>
+              </w:rPr>
+              <w:t>S</w:t>
+            </w:r>
+          </w:p>
+        </w:tc>
+        <w:tc>
+          <w:tcPr>
+            <w:tcW w:type="dxa" w:w="475"/>
+            <w:shd w:val="clear" w:color="auto" w:fill="EB6834"/>
+          </w:tcPr>
+          <w:p>
+            <w:pPr>
+              <w:spacing w:line="240" w:lineRule="auto"/>
+              <w:ind w:firstLine="0"/>
+            </w:pPr>
+            <w:r/>
+            <w:r>
+              <w:rPr>
+                <w:b/>
+                <w:color w:val="FFFFFF"/>
+                <w:sz w:val="16"/>
+              </w:rPr>
+              <w:t>SS</w:t>
+            </w:r>
+          </w:p>
+        </w:tc>
+        <w:tc>
+          <w:tcPr>
+            <w:tcW w:type="dxa" w:w="403"/>
+            <w:shd w:val="clear" w:color="auto" w:fill="EB6834"/>
+          </w:tcPr>
+          <w:p>
+            <w:pPr>
+              <w:spacing w:line="240" w:lineRule="auto"/>
+              <w:ind w:firstLine="0"/>
+            </w:pPr>
+            <w:r/>
+            <w:r>
+              <w:rPr>
+                <w:b/>
+                <w:color w:val="FFFFFF"/>
+                <w:sz w:val="16"/>
+              </w:rPr>
+              <w:t>L</w:t>
+            </w:r>
+          </w:p>
+        </w:tc>
+        <w:tc>
+          <w:tcPr>
+            <w:tcW w:type="dxa" w:w="360"/>
+            <w:shd w:val="clear" w:color="auto" w:fill="EB6834"/>
+          </w:tcPr>
+          <w:p>
+            <w:pPr>
+              <w:spacing w:line="240" w:lineRule="auto"/>
+              <w:ind w:firstLine="0"/>
+            </w:pPr>
+            <w:r/>
+            <w:r>
+              <w:rPr>
+                <w:b/>
+                <w:color w:val="FFFFFF"/>
+                <w:sz w:val="16"/>
+              </w:rPr>
+              <w:t>n</w:t>
+            </w:r>
+          </w:p>
+        </w:tc>
+        <w:tc>
+          <w:tcPr>
+            <w:tcW w:type="dxa" w:w="547"/>
+            <w:shd w:val="clear" w:color="auto" w:fill="EB6834"/>
+          </w:tcPr>
+          <w:p>
+            <w:pPr>
+              <w:spacing w:line="240" w:lineRule="auto"/>
+              <w:ind w:firstLine="0"/>
+            </w:pPr>
+            <w:r/>
+            <w:r>
+              <w:rPr>
+                <w:b/>
+                <w:color w:val="FFFFFF"/>
+                <w:sz w:val="16"/>
+              </w:rPr>
+              <w:t>u</w:t>
+            </w:r>
+          </w:p>
+        </w:tc>
+        <w:tc>
+          <w:tcPr>
+            <w:tcW w:type="dxa" w:w="547"/>
+            <w:shd w:val="clear" w:color="auto" w:fill="EB6834"/>
+          </w:tcPr>
+          <w:p>
+            <w:pPr>
+              <w:spacing w:line="240" w:lineRule="auto"/>
+              <w:ind w:firstLine="0"/>
+            </w:pPr>
+            <w:r/>
+            <w:r>
+              <w:rPr>
+                <w:b/>
+                <w:color w:val="FFFFFF"/>
+                <w:sz w:val="16"/>
+              </w:rPr>
+              <w:t>C</w:t>
+            </w:r>
+          </w:p>
+        </w:tc>
+        <w:tc>
+          <w:tcPr>
+            <w:tcW w:type="dxa" w:w="518"/>
+            <w:shd w:val="clear" w:color="auto" w:fill="EB6834"/>
+          </w:tcPr>
+          <w:p>
+            <w:pPr>
+              <w:spacing w:line="240" w:lineRule="auto"/>
+              <w:ind w:firstLine="0"/>
+            </w:pPr>
+            <w:r/>
+            <w:r>
+              <w:rPr>
+                <w:b/>
+                <w:color w:val="FFFFFF"/>
+                <w:sz w:val="16"/>
+              </w:rPr>
+              <w:t>G</w:t>
+            </w:r>
+          </w:p>
+        </w:tc>
+        <w:tc>
+          <w:tcPr>
+            <w:tcW w:type="dxa" w:w="475"/>
+            <w:shd w:val="clear" w:color="auto" w:fill="EB6834"/>
+          </w:tcPr>
+          <w:p>
+            <w:pPr>
+              <w:spacing w:line="240" w:lineRule="auto"/>
+              <w:ind w:firstLine="0"/>
+            </w:pPr>
+            <w:r/>
+            <w:r>
+              <w:rPr>
+                <w:b/>
+                <w:color w:val="FFFFFF"/>
+                <w:sz w:val="16"/>
+              </w:rPr>
+              <w:t>R</w:t>
+            </w:r>
+          </w:p>
+        </w:tc>
+        <w:tc>
+          <w:tcPr>
+            <w:tcW w:type="dxa" w:w="950"/>
+            <w:shd w:val="clear" w:color="auto" w:fill="EB6834"/>
+          </w:tcPr>
+          <w:p>
+            <w:pPr>
+              <w:spacing w:line="240" w:lineRule="auto"/>
+              <w:ind w:firstLine="0"/>
+            </w:pPr>
+            <w:r/>
+            <w:r>
+              <w:rPr>
+                <w:b/>
+                <w:color w:val="FFFFFF"/>
+                <w:sz w:val="16"/>
+              </w:rPr>
+              <w:t>Status</w:t>
+            </w:r>
+          </w:p>
+        </w:tc>
+        <w:tc>
+          <w:tcPr>
+            <w:tcW w:type="dxa" w:w="2088"/>
+            <w:shd w:val="clear" w:color="auto" w:fill="EB6834"/>
+          </w:tcPr>
+          <w:p>
+            <w:pPr>
+              <w:spacing w:line="240" w:lineRule="auto"/>
+              <w:ind w:firstLine="0"/>
+            </w:pPr>
+            <w:r/>
+            <w:r>
+              <w:rPr>
+                <w:b/>
+                <w:color w:val="FFFFFF"/>
+                <w:sz w:val="16"/>
+              </w:rPr>
+              <w:t>Mitigation</w:t>
+            </w:r>
+          </w:p>
+        </w:tc>
+      </w:tr>
+      <w:tr>
+        <w:tc>
+          <w:tcPr>
+            <w:tcW w:type="dxa" w:w="1368"/>
+          </w:tcPr>
+          <w:p>
+            <w:pPr>
+              <w:spacing w:line="240" w:lineRule="auto"/>
+              <w:ind w:firstLine="0"/>
+            </w:pPr>
+            <w:r/>
+            <w:r>
+              <w:rPr>
+                <w:b/>
+                <w:sz w:val="16"/>
+              </w:rPr>
+              <w:t>RF generator</w:t>
+            </w:r>
+          </w:p>
+        </w:tc>
+        <w:tc>
+          <w:tcPr>
+            <w:tcW w:type="dxa" w:w="576"/>
+          </w:tcPr>
+          <w:p>
+            <w:pPr>
+              <w:spacing w:line="240" w:lineRule="auto"/>
+              <w:ind w:firstLine="0"/>
+            </w:pPr>
+            <w:r/>
+            <w:r>
+              <w:rPr>
+                <w:b w:val="0"/>
+                <w:sz w:val="16"/>
+              </w:rPr>
+              <w:t>120</w:t>
+            </w:r>
+          </w:p>
+        </w:tc>
+        <w:tc>
+          <w:tcPr>
+            <w:tcW w:type="dxa" w:w="547"/>
+          </w:tcPr>
+          <w:p>
+            <w:pPr>
+              <w:spacing w:line="240" w:lineRule="auto"/>
+              <w:ind w:firstLine="0"/>
+            </w:pPr>
+            <w:r/>
+            <w:r>
+              <w:rPr>
+                <w:b w:val="0"/>
+                <w:sz w:val="16"/>
+              </w:rPr>
+              <w:t>20</w:t>
+            </w:r>
+          </w:p>
+        </w:tc>
+        <w:tc>
+          <w:tcPr>
+            <w:tcW w:type="dxa" w:w="547"/>
+          </w:tcPr>
+          <w:p>
+            <w:pPr>
+              <w:spacing w:line="240" w:lineRule="auto"/>
+              <w:ind w:firstLine="0"/>
+            </w:pPr>
+            <w:r/>
+            <w:r>
+              <w:rPr>
+                <w:b w:val="0"/>
+                <w:sz w:val="16"/>
+              </w:rPr>
+              <w:t>40</w:t>
+            </w:r>
+          </w:p>
+        </w:tc>
+        <w:tc>
+          <w:tcPr>
+            <w:tcW w:type="dxa" w:w="475"/>
+          </w:tcPr>
+          <w:p>
+            <w:pPr>
+              <w:spacing w:line="240" w:lineRule="auto"/>
+              <w:ind w:firstLine="0"/>
+            </w:pPr>
+            <w:r/>
+            <w:r>
+              <w:rPr>
+                <w:b w:val="0"/>
+                <w:sz w:val="16"/>
+              </w:rPr>
+              <w:t>15</w:t>
+            </w:r>
+          </w:p>
+        </w:tc>
+        <w:tc>
+          <w:tcPr>
+            <w:tcW w:type="dxa" w:w="403"/>
+          </w:tcPr>
+          <w:p>
+            <w:pPr>
+              <w:spacing w:line="240" w:lineRule="auto"/>
+              <w:ind w:firstLine="0"/>
+            </w:pPr>
+            <w:r/>
+            <w:r>
+              <w:rPr>
+                <w:b w:val="0"/>
+                <w:sz w:val="16"/>
+              </w:rPr>
+              <w:t>26</w:t>
+            </w:r>
+          </w:p>
+        </w:tc>
+        <w:tc>
+          <w:tcPr>
+            <w:tcW w:type="dxa" w:w="360"/>
+          </w:tcPr>
+          <w:p>
+            <w:pPr>
+              <w:spacing w:line="240" w:lineRule="auto"/>
+              <w:ind w:firstLine="0"/>
+            </w:pPr>
+            <w:r/>
+            <w:r>
+              <w:rPr>
+                <w:b w:val="0"/>
+                <w:sz w:val="16"/>
+              </w:rPr>
+              <w:t>1</w:t>
+            </w:r>
+          </w:p>
+        </w:tc>
+        <w:tc>
+          <w:tcPr>
+            <w:tcW w:type="dxa" w:w="547"/>
+          </w:tcPr>
+          <w:p>
+            <w:pPr>
+              <w:spacing w:line="240" w:lineRule="auto"/>
+              <w:ind w:firstLine="0"/>
+            </w:pPr>
+            <w:r/>
+            <w:r>
+              <w:rPr>
+                <w:b w:val="0"/>
+                <w:sz w:val="16"/>
+              </w:rPr>
+              <w:t>0.95</w:t>
+            </w:r>
+          </w:p>
+        </w:tc>
+        <w:tc>
+          <w:tcPr>
+            <w:tcW w:type="dxa" w:w="547"/>
+          </w:tcPr>
+          <w:p>
+            <w:pPr>
+              <w:spacing w:line="240" w:lineRule="auto"/>
+              <w:ind w:firstLine="0"/>
+            </w:pPr>
+            <w:r/>
+            <w:r>
+              <w:rPr>
+                <w:b w:val="0"/>
+                <w:sz w:val="16"/>
+              </w:rPr>
+              <w:t>0.44</w:t>
+            </w:r>
+          </w:p>
+        </w:tc>
+        <w:tc>
+          <w:tcPr>
+            <w:tcW w:type="dxa" w:w="518"/>
+          </w:tcPr>
+          <w:p>
+            <w:pPr>
+              <w:spacing w:line="240" w:lineRule="auto"/>
+              <w:ind w:firstLine="0"/>
+            </w:pPr>
+            <w:r/>
+            <w:r>
+              <w:rPr>
+                <w:b w:val="0"/>
+                <w:sz w:val="16"/>
+              </w:rPr>
+              <w:t>75</w:t>
+            </w:r>
+          </w:p>
+        </w:tc>
+        <w:tc>
+          <w:tcPr>
+            <w:tcW w:type="dxa" w:w="475"/>
+            <w:shd w:val="clear" w:color="auto" w:fill="F6C4C4"/>
+          </w:tcPr>
+          <w:p>
+            <w:pPr>
+              <w:spacing w:line="240" w:lineRule="auto"/>
+              <w:ind w:firstLine="0"/>
+            </w:pPr>
+            <w:r/>
+            <w:r>
+              <w:rPr>
+                <w:b w:val="0"/>
+                <w:sz w:val="16"/>
+              </w:rPr>
+              <w:t>83</w:t>
+            </w:r>
+          </w:p>
+        </w:tc>
+        <w:tc>
+          <w:tcPr>
+            <w:tcW w:type="dxa" w:w="950"/>
+            <w:shd w:val="clear" w:color="auto" w:fill="F6C4C4"/>
+          </w:tcPr>
+          <w:p>
+            <w:pPr>
+              <w:spacing w:line="240" w:lineRule="auto"/>
+              <w:ind w:firstLine="0"/>
+            </w:pPr>
+            <w:r/>
+            <w:r>
+              <w:rPr>
+                <w:b w:val="0"/>
+                <w:sz w:val="16"/>
+              </w:rPr>
+              <w:t>Critical</w:t>
+            </w:r>
+          </w:p>
+        </w:tc>
+        <w:tc>
+          <w:tcPr>
+            <w:tcW w:type="dxa" w:w="2088"/>
+            <w:shd w:val="clear" w:color="auto" w:fill="F6C4C4"/>
+          </w:tcPr>
+          <w:p>
+            <w:pPr>
+              <w:spacing w:line="240" w:lineRule="auto"/>
+              <w:ind w:firstLine="0"/>
+            </w:pPr>
+            <w:r/>
+            <w:r>
+              <w:rPr>
+                <w:b w:val="0"/>
+                <w:sz w:val="16"/>
+              </w:rPr>
+              <w:t>Capacity reservation, expedite, qualify alternate source</w:t>
+            </w:r>
+          </w:p>
+        </w:tc>
+      </w:tr>
+      <w:tr>
+        <w:tc>
+          <w:tcPr>
+            <w:tcW w:type="dxa" w:w="1368"/>
+          </w:tcPr>
+          <w:p>
+            <w:pPr>
+              <w:spacing w:line="240" w:lineRule="auto"/>
+              <w:ind w:firstLine="0"/>
+            </w:pPr>
+            <w:r/>
+            <w:r>
+              <w:rPr>
+                <w:b/>
+                <w:sz w:val="16"/>
+              </w:rPr>
+              <w:t>Ceramic chuck</w:t>
+            </w:r>
+          </w:p>
+        </w:tc>
+        <w:tc>
+          <w:tcPr>
+            <w:tcW w:type="dxa" w:w="576"/>
+          </w:tcPr>
+          <w:p>
+            <w:pPr>
+              <w:spacing w:line="240" w:lineRule="auto"/>
+              <w:ind w:firstLine="0"/>
+            </w:pPr>
+            <w:r/>
+            <w:r>
+              <w:rPr>
+                <w:b w:val="0"/>
+                <w:sz w:val="16"/>
+              </w:rPr>
+              <w:t>90</w:t>
+            </w:r>
+          </w:p>
+        </w:tc>
+        <w:tc>
+          <w:tcPr>
+            <w:tcW w:type="dxa" w:w="547"/>
+          </w:tcPr>
+          <w:p>
+            <w:pPr>
+              <w:spacing w:line="240" w:lineRule="auto"/>
+              <w:ind w:firstLine="0"/>
+            </w:pPr>
+            <w:r/>
+            <w:r>
+              <w:rPr>
+                <w:b w:val="0"/>
+                <w:sz w:val="16"/>
+              </w:rPr>
+              <w:t>15</w:t>
+            </w:r>
+          </w:p>
+        </w:tc>
+        <w:tc>
+          <w:tcPr>
+            <w:tcW w:type="dxa" w:w="547"/>
+          </w:tcPr>
+          <w:p>
+            <w:pPr>
+              <w:spacing w:line="240" w:lineRule="auto"/>
+              <w:ind w:firstLine="0"/>
+            </w:pPr>
+            <w:r/>
+            <w:r>
+              <w:rPr>
+                <w:b w:val="0"/>
+                <w:sz w:val="16"/>
+              </w:rPr>
+              <w:t>45</w:t>
+            </w:r>
+          </w:p>
+        </w:tc>
+        <w:tc>
+          <w:tcPr>
+            <w:tcW w:type="dxa" w:w="475"/>
+          </w:tcPr>
+          <w:p>
+            <w:pPr>
+              <w:spacing w:line="240" w:lineRule="auto"/>
+              <w:ind w:firstLine="0"/>
+            </w:pPr>
+            <w:r/>
+            <w:r>
+              <w:rPr>
+                <w:b w:val="0"/>
+                <w:sz w:val="16"/>
+              </w:rPr>
+              <w:t>10</w:t>
+            </w:r>
+          </w:p>
+        </w:tc>
+        <w:tc>
+          <w:tcPr>
+            <w:tcW w:type="dxa" w:w="403"/>
+          </w:tcPr>
+          <w:p>
+            <w:pPr>
+              <w:spacing w:line="240" w:lineRule="auto"/>
+              <w:ind w:firstLine="0"/>
+            </w:pPr>
+            <w:r/>
+            <w:r>
+              <w:rPr>
+                <w:b w:val="0"/>
+                <w:sz w:val="16"/>
+              </w:rPr>
+              <w:t>20</w:t>
+            </w:r>
+          </w:p>
+        </w:tc>
+        <w:tc>
+          <w:tcPr>
+            <w:tcW w:type="dxa" w:w="360"/>
+          </w:tcPr>
+          <w:p>
+            <w:pPr>
+              <w:spacing w:line="240" w:lineRule="auto"/>
+              <w:ind w:firstLine="0"/>
+            </w:pPr>
+            <w:r/>
+            <w:r>
+              <w:rPr>
+                <w:b w:val="0"/>
+                <w:sz w:val="16"/>
+              </w:rPr>
+              <w:t>1</w:t>
+            </w:r>
+          </w:p>
+        </w:tc>
+        <w:tc>
+          <w:tcPr>
+            <w:tcW w:type="dxa" w:w="547"/>
+          </w:tcPr>
+          <w:p>
+            <w:pPr>
+              <w:spacing w:line="240" w:lineRule="auto"/>
+              <w:ind w:firstLine="0"/>
+            </w:pPr>
+            <w:r/>
+            <w:r>
+              <w:rPr>
+                <w:b w:val="0"/>
+                <w:sz w:val="16"/>
+              </w:rPr>
+              <w:t>0.85</w:t>
+            </w:r>
+          </w:p>
+        </w:tc>
+        <w:tc>
+          <w:tcPr>
+            <w:tcW w:type="dxa" w:w="547"/>
+          </w:tcPr>
+          <w:p>
+            <w:pPr>
+              <w:spacing w:line="240" w:lineRule="auto"/>
+              <w:ind w:firstLine="0"/>
+            </w:pPr>
+            <w:r/>
+            <w:r>
+              <w:rPr>
+                <w:b w:val="0"/>
+                <w:sz w:val="16"/>
+              </w:rPr>
+              <w:t>0.60</w:t>
+            </w:r>
+          </w:p>
+        </w:tc>
+        <w:tc>
+          <w:tcPr>
+            <w:tcW w:type="dxa" w:w="518"/>
+          </w:tcPr>
+          <w:p>
+            <w:pPr>
+              <w:spacing w:line="240" w:lineRule="auto"/>
+              <w:ind w:firstLine="0"/>
+            </w:pPr>
+            <w:r/>
+            <w:r>
+              <w:rPr>
+                <w:b w:val="0"/>
+                <w:sz w:val="16"/>
+              </w:rPr>
+              <w:t>40</w:t>
+            </w:r>
+          </w:p>
+        </w:tc>
+        <w:tc>
+          <w:tcPr>
+            <w:tcW w:type="dxa" w:w="475"/>
+            <w:shd w:val="clear" w:color="auto" w:fill="F6C4C4"/>
+          </w:tcPr>
+          <w:p>
+            <w:pPr>
+              <w:spacing w:line="240" w:lineRule="auto"/>
+              <w:ind w:firstLine="0"/>
+            </w:pPr>
+            <w:r/>
+            <w:r>
+              <w:rPr>
+                <w:b w:val="0"/>
+                <w:sz w:val="16"/>
+              </w:rPr>
+              <w:t>76</w:t>
+            </w:r>
+          </w:p>
+        </w:tc>
+        <w:tc>
+          <w:tcPr>
+            <w:tcW w:type="dxa" w:w="950"/>
+            <w:shd w:val="clear" w:color="auto" w:fill="F6C4C4"/>
+          </w:tcPr>
+          <w:p>
+            <w:pPr>
+              <w:spacing w:line="240" w:lineRule="auto"/>
+              <w:ind w:firstLine="0"/>
+            </w:pPr>
+            <w:r/>
+            <w:r>
+              <w:rPr>
+                <w:b w:val="0"/>
+                <w:sz w:val="16"/>
+              </w:rPr>
+              <w:t>Critical</w:t>
+            </w:r>
+          </w:p>
+        </w:tc>
+        <w:tc>
+          <w:tcPr>
+            <w:tcW w:type="dxa" w:w="2088"/>
+            <w:shd w:val="clear" w:color="auto" w:fill="F6C4C4"/>
+          </w:tcPr>
+          <w:p>
+            <w:pPr>
+              <w:spacing w:line="240" w:lineRule="auto"/>
+              <w:ind w:firstLine="0"/>
+            </w:pPr>
+            <w:r/>
+            <w:r>
+              <w:rPr>
+                <w:b w:val="0"/>
+                <w:sz w:val="16"/>
+              </w:rPr>
+              <w:t>Capacity reservation, expedite, qualify alternate source</w:t>
+            </w:r>
+          </w:p>
+        </w:tc>
+      </w:tr>
+      <w:tr>
+        <w:tc>
+          <w:tcPr>
+            <w:tcW w:type="dxa" w:w="1368"/>
+          </w:tcPr>
+          <w:p>
+            <w:pPr>
+              <w:spacing w:line="240" w:lineRule="auto"/>
+              <w:ind w:firstLine="0"/>
+            </w:pPr>
+            <w:r/>
+            <w:r>
+              <w:rPr>
+                <w:b/>
+                <w:sz w:val="16"/>
+              </w:rPr>
+              <w:t>Vacuum valve</w:t>
+            </w:r>
+          </w:p>
+        </w:tc>
+        <w:tc>
+          <w:tcPr>
+            <w:tcW w:type="dxa" w:w="576"/>
+          </w:tcPr>
+          <w:p>
+            <w:pPr>
+              <w:spacing w:line="240" w:lineRule="auto"/>
+              <w:ind w:firstLine="0"/>
+            </w:pPr>
+            <w:r/>
+            <w:r>
+              <w:rPr>
+                <w:b w:val="0"/>
+                <w:sz w:val="16"/>
+              </w:rPr>
+              <w:t>300</w:t>
+            </w:r>
+          </w:p>
+        </w:tc>
+        <w:tc>
+          <w:tcPr>
+            <w:tcW w:type="dxa" w:w="547"/>
+          </w:tcPr>
+          <w:p>
+            <w:pPr>
+              <w:spacing w:line="240" w:lineRule="auto"/>
+              <w:ind w:firstLine="0"/>
+            </w:pPr>
+            <w:r/>
+            <w:r>
+              <w:rPr>
+                <w:b w:val="0"/>
+                <w:sz w:val="16"/>
+              </w:rPr>
+              <w:t>80</w:t>
+            </w:r>
+          </w:p>
+        </w:tc>
+        <w:tc>
+          <w:tcPr>
+            <w:tcW w:type="dxa" w:w="547"/>
+          </w:tcPr>
+          <w:p>
+            <w:pPr>
+              <w:spacing w:line="240" w:lineRule="auto"/>
+              <w:ind w:firstLine="0"/>
+            </w:pPr>
+            <w:r/>
+            <w:r>
+              <w:rPr>
+                <w:b w:val="0"/>
+                <w:sz w:val="16"/>
+              </w:rPr>
+              <w:t>150</w:t>
+            </w:r>
+          </w:p>
+        </w:tc>
+        <w:tc>
+          <w:tcPr>
+            <w:tcW w:type="dxa" w:w="475"/>
+          </w:tcPr>
+          <w:p>
+            <w:pPr>
+              <w:spacing w:line="240" w:lineRule="auto"/>
+              <w:ind w:firstLine="0"/>
+            </w:pPr>
+            <w:r/>
+            <w:r>
+              <w:rPr>
+                <w:b w:val="0"/>
+                <w:sz w:val="16"/>
+              </w:rPr>
+              <w:t>30</w:t>
+            </w:r>
+          </w:p>
+        </w:tc>
+        <w:tc>
+          <w:tcPr>
+            <w:tcW w:type="dxa" w:w="403"/>
+          </w:tcPr>
+          <w:p>
+            <w:pPr>
+              <w:spacing w:line="240" w:lineRule="auto"/>
+              <w:ind w:firstLine="0"/>
+            </w:pPr>
+            <w:r/>
+            <w:r>
+              <w:rPr>
+                <w:b w:val="0"/>
+                <w:sz w:val="16"/>
+              </w:rPr>
+              <w:t>14</w:t>
+            </w:r>
+          </w:p>
+        </w:tc>
+        <w:tc>
+          <w:tcPr>
+            <w:tcW w:type="dxa" w:w="360"/>
+          </w:tcPr>
+          <w:p>
+            <w:pPr>
+              <w:spacing w:line="240" w:lineRule="auto"/>
+              <w:ind w:firstLine="0"/>
+            </w:pPr>
+            <w:r/>
+            <w:r>
+              <w:rPr>
+                <w:b w:val="0"/>
+                <w:sz w:val="16"/>
+              </w:rPr>
+              <w:t>2</w:t>
+            </w:r>
+          </w:p>
+        </w:tc>
+        <w:tc>
+          <w:tcPr>
+            <w:tcW w:type="dxa" w:w="547"/>
+          </w:tcPr>
+          <w:p>
+            <w:pPr>
+              <w:spacing w:line="240" w:lineRule="auto"/>
+              <w:ind w:firstLine="0"/>
+            </w:pPr>
+            <w:r/>
+            <w:r>
+              <w:rPr>
+                <w:b w:val="0"/>
+                <w:sz w:val="16"/>
+              </w:rPr>
+              <w:t>0.80</w:t>
+            </w:r>
+          </w:p>
+        </w:tc>
+        <w:tc>
+          <w:tcPr>
+            <w:tcW w:type="dxa" w:w="547"/>
+          </w:tcPr>
+          <w:p>
+            <w:pPr>
+              <w:spacing w:line="240" w:lineRule="auto"/>
+              <w:ind w:firstLine="0"/>
+            </w:pPr>
+            <w:r/>
+            <w:r>
+              <w:rPr>
+                <w:b w:val="0"/>
+                <w:sz w:val="16"/>
+              </w:rPr>
+              <w:t>0.70</w:t>
+            </w:r>
+          </w:p>
+        </w:tc>
+        <w:tc>
+          <w:tcPr>
+            <w:tcW w:type="dxa" w:w="518"/>
+          </w:tcPr>
+          <w:p>
+            <w:pPr>
+              <w:spacing w:line="240" w:lineRule="auto"/>
+              <w:ind w:firstLine="0"/>
+            </w:pPr>
+            <w:r/>
+            <w:r>
+              <w:rPr>
+                <w:b w:val="0"/>
+                <w:sz w:val="16"/>
+              </w:rPr>
+              <w:t>100</w:t>
+            </w:r>
+          </w:p>
+        </w:tc>
+        <w:tc>
+          <w:tcPr>
+            <w:tcW w:type="dxa" w:w="475"/>
+            <w:shd w:val="clear" w:color="auto" w:fill="FADCCD"/>
+          </w:tcPr>
+          <w:p>
+            <w:pPr>
+              <w:spacing w:line="240" w:lineRule="auto"/>
+              <w:ind w:firstLine="0"/>
+            </w:pPr>
+            <w:r/>
+            <w:r>
+              <w:rPr>
+                <w:b w:val="0"/>
+                <w:sz w:val="16"/>
+              </w:rPr>
+              <w:t>62</w:t>
+            </w:r>
+          </w:p>
+        </w:tc>
+        <w:tc>
+          <w:tcPr>
+            <w:tcW w:type="dxa" w:w="950"/>
+            <w:shd w:val="clear" w:color="auto" w:fill="FADCCD"/>
+          </w:tcPr>
+          <w:p>
+            <w:pPr>
+              <w:spacing w:line="240" w:lineRule="auto"/>
+              <w:ind w:firstLine="0"/>
+            </w:pPr>
+            <w:r/>
+            <w:r>
+              <w:rPr>
+                <w:b w:val="0"/>
+                <w:sz w:val="16"/>
+              </w:rPr>
+              <w:t>Serious</w:t>
+            </w:r>
+          </w:p>
+        </w:tc>
+        <w:tc>
+          <w:tcPr>
+            <w:tcW w:type="dxa" w:w="2088"/>
+            <w:shd w:val="clear" w:color="auto" w:fill="FADCCD"/>
+          </w:tcPr>
+          <w:p>
+            <w:pPr>
+              <w:spacing w:line="240" w:lineRule="auto"/>
+              <w:ind w:firstLine="0"/>
+            </w:pPr>
+            <w:r/>
+            <w:r>
+              <w:rPr>
+                <w:b w:val="0"/>
+                <w:sz w:val="16"/>
+              </w:rPr>
+              <w:t>Multi-source and raise strategic safety stock</w:t>
+            </w:r>
+          </w:p>
+        </w:tc>
+      </w:tr>
+      <w:tr>
+        <w:tc>
+          <w:tcPr>
+            <w:tcW w:type="dxa" w:w="1368"/>
+          </w:tcPr>
+          <w:p>
+            <w:pPr>
+              <w:spacing w:line="240" w:lineRule="auto"/>
+              <w:ind w:firstLine="0"/>
+            </w:pPr>
+            <w:r/>
+            <w:r>
+              <w:rPr>
+                <w:b/>
+                <w:sz w:val="16"/>
+              </w:rPr>
+              <w:t>Quartz liner</w:t>
+            </w:r>
+          </w:p>
+        </w:tc>
+        <w:tc>
+          <w:tcPr>
+            <w:tcW w:type="dxa" w:w="576"/>
+          </w:tcPr>
+          <w:p>
+            <w:pPr>
+              <w:spacing w:line="240" w:lineRule="auto"/>
+              <w:ind w:firstLine="0"/>
+            </w:pPr>
+            <w:r/>
+            <w:r>
+              <w:rPr>
+                <w:b w:val="0"/>
+                <w:sz w:val="16"/>
+              </w:rPr>
+              <w:t>200</w:t>
+            </w:r>
+          </w:p>
+        </w:tc>
+        <w:tc>
+          <w:tcPr>
+            <w:tcW w:type="dxa" w:w="547"/>
+          </w:tcPr>
+          <w:p>
+            <w:pPr>
+              <w:spacing w:line="240" w:lineRule="auto"/>
+              <w:ind w:firstLine="0"/>
+            </w:pPr>
+            <w:r/>
+            <w:r>
+              <w:rPr>
+                <w:b w:val="0"/>
+                <w:sz w:val="16"/>
+              </w:rPr>
+              <w:t>60</w:t>
+            </w:r>
+          </w:p>
+        </w:tc>
+        <w:tc>
+          <w:tcPr>
+            <w:tcW w:type="dxa" w:w="547"/>
+          </w:tcPr>
+          <w:p>
+            <w:pPr>
+              <w:spacing w:line="240" w:lineRule="auto"/>
+              <w:ind w:firstLine="0"/>
+            </w:pPr>
+            <w:r/>
+            <w:r>
+              <w:rPr>
+                <w:b w:val="0"/>
+                <w:sz w:val="16"/>
+              </w:rPr>
+              <w:t>120</w:t>
+            </w:r>
+          </w:p>
+        </w:tc>
+        <w:tc>
+          <w:tcPr>
+            <w:tcW w:type="dxa" w:w="475"/>
+          </w:tcPr>
+          <w:p>
+            <w:pPr>
+              <w:spacing w:line="240" w:lineRule="auto"/>
+              <w:ind w:firstLine="0"/>
+            </w:pPr>
+            <w:r/>
+            <w:r>
+              <w:rPr>
+                <w:b w:val="0"/>
+                <w:sz w:val="16"/>
+              </w:rPr>
+              <w:t>20</w:t>
+            </w:r>
+          </w:p>
+        </w:tc>
+        <w:tc>
+          <w:tcPr>
+            <w:tcW w:type="dxa" w:w="403"/>
+          </w:tcPr>
+          <w:p>
+            <w:pPr>
+              <w:spacing w:line="240" w:lineRule="auto"/>
+              <w:ind w:firstLine="0"/>
+            </w:pPr>
+            <w:r/>
+            <w:r>
+              <w:rPr>
+                <w:b w:val="0"/>
+                <w:sz w:val="16"/>
+              </w:rPr>
+              <w:t>10</w:t>
+            </w:r>
+          </w:p>
+        </w:tc>
+        <w:tc>
+          <w:tcPr>
+            <w:tcW w:type="dxa" w:w="360"/>
+          </w:tcPr>
+          <w:p>
+            <w:pPr>
+              <w:spacing w:line="240" w:lineRule="auto"/>
+              <w:ind w:firstLine="0"/>
+            </w:pPr>
+            <w:r/>
+            <w:r>
+              <w:rPr>
+                <w:b w:val="0"/>
+                <w:sz w:val="16"/>
+              </w:rPr>
+              <w:t>2</w:t>
+            </w:r>
+          </w:p>
+        </w:tc>
+        <w:tc>
+          <w:tcPr>
+            <w:tcW w:type="dxa" w:w="547"/>
+          </w:tcPr>
+          <w:p>
+            <w:pPr>
+              <w:spacing w:line="240" w:lineRule="auto"/>
+              <w:ind w:firstLine="0"/>
+            </w:pPr>
+            <w:r/>
+            <w:r>
+              <w:rPr>
+                <w:b w:val="0"/>
+                <w:sz w:val="16"/>
+              </w:rPr>
+              <w:t>0.70</w:t>
+            </w:r>
+          </w:p>
+        </w:tc>
+        <w:tc>
+          <w:tcPr>
+            <w:tcW w:type="dxa" w:w="547"/>
+          </w:tcPr>
+          <w:p>
+            <w:pPr>
+              <w:spacing w:line="240" w:lineRule="auto"/>
+              <w:ind w:firstLine="0"/>
+            </w:pPr>
+            <w:r/>
+            <w:r>
+              <w:rPr>
+                <w:b w:val="0"/>
+                <w:sz w:val="16"/>
+              </w:rPr>
+              <w:t>0.82</w:t>
+            </w:r>
+          </w:p>
+        </w:tc>
+        <w:tc>
+          <w:tcPr>
+            <w:tcW w:type="dxa" w:w="518"/>
+          </w:tcPr>
+          <w:p>
+            <w:pPr>
+              <w:spacing w:line="240" w:lineRule="auto"/>
+              <w:ind w:firstLine="0"/>
+            </w:pPr>
+            <w:r/>
+            <w:r>
+              <w:rPr>
+                <w:b w:val="0"/>
+                <w:sz w:val="16"/>
+              </w:rPr>
+              <w:t>40</w:t>
+            </w:r>
+          </w:p>
+        </w:tc>
+        <w:tc>
+          <w:tcPr>
+            <w:tcW w:type="dxa" w:w="475"/>
+            <w:shd w:val="clear" w:color="auto" w:fill="FADCCD"/>
+          </w:tcPr>
+          <w:p>
+            <w:pPr>
+              <w:spacing w:line="240" w:lineRule="auto"/>
+              <w:ind w:firstLine="0"/>
+            </w:pPr>
+            <w:r/>
+            <w:r>
+              <w:rPr>
+                <w:b w:val="0"/>
+                <w:sz w:val="16"/>
+              </w:rPr>
+              <w:t>50</w:t>
+            </w:r>
+          </w:p>
+        </w:tc>
+        <w:tc>
+          <w:tcPr>
+            <w:tcW w:type="dxa" w:w="950"/>
+            <w:shd w:val="clear" w:color="auto" w:fill="FADCCD"/>
+          </w:tcPr>
+          <w:p>
+            <w:pPr>
+              <w:spacing w:line="240" w:lineRule="auto"/>
+              <w:ind w:firstLine="0"/>
+            </w:pPr>
+            <w:r/>
+            <w:r>
+              <w:rPr>
+                <w:b w:val="0"/>
+                <w:sz w:val="16"/>
+              </w:rPr>
+              <w:t>Serious</w:t>
+            </w:r>
+          </w:p>
+        </w:tc>
+        <w:tc>
+          <w:tcPr>
+            <w:tcW w:type="dxa" w:w="2088"/>
+            <w:shd w:val="clear" w:color="auto" w:fill="FADCCD"/>
+          </w:tcPr>
+          <w:p>
+            <w:pPr>
+              <w:spacing w:line="240" w:lineRule="auto"/>
+              <w:ind w:firstLine="0"/>
+            </w:pPr>
+            <w:r/>
+            <w:r>
+              <w:rPr>
+                <w:b w:val="0"/>
+                <w:sz w:val="16"/>
+              </w:rPr>
+              <w:t>Multi-source and raise strategic safety stock</w:t>
+            </w:r>
+          </w:p>
+        </w:tc>
+      </w:tr>
+      <w:tr>
+        <w:tc>
+          <w:tcPr>
+            <w:tcW w:type="dxa" w:w="1368"/>
+          </w:tcPr>
+          <w:p>
+            <w:pPr>
+              <w:spacing w:line="240" w:lineRule="auto"/>
+              <w:ind w:firstLine="0"/>
+            </w:pPr>
+            <w:r/>
+            <w:r>
+              <w:rPr>
+                <w:b/>
+                <w:sz w:val="16"/>
+              </w:rPr>
+              <w:t>Power supply</w:t>
+            </w:r>
+          </w:p>
+        </w:tc>
+        <w:tc>
+          <w:tcPr>
+            <w:tcW w:type="dxa" w:w="576"/>
+          </w:tcPr>
+          <w:p>
+            <w:pPr>
+              <w:spacing w:line="240" w:lineRule="auto"/>
+              <w:ind w:firstLine="0"/>
+            </w:pPr>
+            <w:r/>
+            <w:r>
+              <w:rPr>
+                <w:b w:val="0"/>
+                <w:sz w:val="16"/>
+              </w:rPr>
+              <w:t>150</w:t>
+            </w:r>
+          </w:p>
+        </w:tc>
+        <w:tc>
+          <w:tcPr>
+            <w:tcW w:type="dxa" w:w="547"/>
+          </w:tcPr>
+          <w:p>
+            <w:pPr>
+              <w:spacing w:line="240" w:lineRule="auto"/>
+              <w:ind w:firstLine="0"/>
+            </w:pPr>
+            <w:r/>
+            <w:r>
+              <w:rPr>
+                <w:b w:val="0"/>
+                <w:sz w:val="16"/>
+              </w:rPr>
+              <w:t>70</w:t>
+            </w:r>
+          </w:p>
+        </w:tc>
+        <w:tc>
+          <w:tcPr>
+            <w:tcW w:type="dxa" w:w="547"/>
+          </w:tcPr>
+          <w:p>
+            <w:pPr>
+              <w:spacing w:line="240" w:lineRule="auto"/>
+              <w:ind w:firstLine="0"/>
+            </w:pPr>
+            <w:r/>
+            <w:r>
+              <w:rPr>
+                <w:b w:val="0"/>
+                <w:sz w:val="16"/>
+              </w:rPr>
+              <w:t>90</w:t>
+            </w:r>
+          </w:p>
+        </w:tc>
+        <w:tc>
+          <w:tcPr>
+            <w:tcW w:type="dxa" w:w="475"/>
+          </w:tcPr>
+          <w:p>
+            <w:pPr>
+              <w:spacing w:line="240" w:lineRule="auto"/>
+              <w:ind w:firstLine="0"/>
+            </w:pPr>
+            <w:r/>
+            <w:r>
+              <w:rPr>
+                <w:b w:val="0"/>
+                <w:sz w:val="16"/>
+              </w:rPr>
+              <w:t>15</w:t>
+            </w:r>
+          </w:p>
+        </w:tc>
+        <w:tc>
+          <w:tcPr>
+            <w:tcW w:type="dxa" w:w="403"/>
+          </w:tcPr>
+          <w:p>
+            <w:pPr>
+              <w:spacing w:line="240" w:lineRule="auto"/>
+              <w:ind w:firstLine="0"/>
+            </w:pPr>
+            <w:r/>
+            <w:r>
+              <w:rPr>
+                <w:b w:val="0"/>
+                <w:sz w:val="16"/>
+              </w:rPr>
+              <w:t>8</w:t>
+            </w:r>
+          </w:p>
+        </w:tc>
+        <w:tc>
+          <w:tcPr>
+            <w:tcW w:type="dxa" w:w="360"/>
+          </w:tcPr>
+          <w:p>
+            <w:pPr>
+              <w:spacing w:line="240" w:lineRule="auto"/>
+              <w:ind w:firstLine="0"/>
+            </w:pPr>
+            <w:r/>
+            <w:r>
+              <w:rPr>
+                <w:b w:val="0"/>
+                <w:sz w:val="16"/>
+              </w:rPr>
+              <w:t>3</w:t>
+            </w:r>
+          </w:p>
+        </w:tc>
+        <w:tc>
+          <w:tcPr>
+            <w:tcW w:type="dxa" w:w="547"/>
+          </w:tcPr>
+          <w:p>
+            <w:pPr>
+              <w:spacing w:line="240" w:lineRule="auto"/>
+              <w:ind w:firstLine="0"/>
+            </w:pPr>
+            <w:r/>
+            <w:r>
+              <w:rPr>
+                <w:b w:val="0"/>
+                <w:sz w:val="16"/>
+              </w:rPr>
+              <w:t>0.60</w:t>
+            </w:r>
+          </w:p>
+        </w:tc>
+        <w:tc>
+          <w:tcPr>
+            <w:tcW w:type="dxa" w:w="547"/>
+          </w:tcPr>
+          <w:p>
+            <w:pPr>
+              <w:spacing w:line="240" w:lineRule="auto"/>
+              <w:ind w:firstLine="0"/>
+            </w:pPr>
+            <w:r/>
+            <w:r>
+              <w:rPr>
+                <w:b w:val="0"/>
+                <w:sz w:val="16"/>
+              </w:rPr>
+              <w:t>0.97</w:t>
+            </w:r>
+          </w:p>
+        </w:tc>
+        <w:tc>
+          <w:tcPr>
+            <w:tcW w:type="dxa" w:w="518"/>
+          </w:tcPr>
+          <w:p>
+            <w:pPr>
+              <w:spacing w:line="240" w:lineRule="auto"/>
+              <w:ind w:firstLine="0"/>
+            </w:pPr>
+            <w:r/>
+            <w:r>
+              <w:rPr>
+                <w:b w:val="0"/>
+                <w:sz w:val="16"/>
+              </w:rPr>
+              <w:t>5</w:t>
+            </w:r>
+          </w:p>
+        </w:tc>
+        <w:tc>
+          <w:tcPr>
+            <w:tcW w:type="dxa" w:w="475"/>
+            <w:shd w:val="clear" w:color="auto" w:fill="FDEBC0"/>
+          </w:tcPr>
+          <w:p>
+            <w:pPr>
+              <w:spacing w:line="240" w:lineRule="auto"/>
+              <w:ind w:firstLine="0"/>
+            </w:pPr>
+            <w:r/>
+            <w:r>
+              <w:rPr>
+                <w:b w:val="0"/>
+                <w:sz w:val="16"/>
+              </w:rPr>
+              <w:t>35</w:t>
+            </w:r>
+          </w:p>
+        </w:tc>
+        <w:tc>
+          <w:tcPr>
+            <w:tcW w:type="dxa" w:w="950"/>
+            <w:shd w:val="clear" w:color="auto" w:fill="FDEBC0"/>
+          </w:tcPr>
+          <w:p>
+            <w:pPr>
+              <w:spacing w:line="240" w:lineRule="auto"/>
+              <w:ind w:firstLine="0"/>
+            </w:pPr>
+            <w:r/>
+            <w:r>
+              <w:rPr>
+                <w:b w:val="0"/>
+                <w:sz w:val="16"/>
+              </w:rPr>
+              <w:t>Warning</w:t>
+            </w:r>
+          </w:p>
+        </w:tc>
+        <w:tc>
+          <w:tcPr>
+            <w:tcW w:type="dxa" w:w="2088"/>
+            <w:shd w:val="clear" w:color="auto" w:fill="FDEBC0"/>
+          </w:tcPr>
+          <w:p>
+            <w:pPr>
+              <w:spacing w:line="240" w:lineRule="auto"/>
+              <w:ind w:firstLine="0"/>
+            </w:pPr>
+            <w:r/>
+            <w:r>
+              <w:rPr>
+                <w:b w:val="0"/>
+                <w:sz w:val="16"/>
+              </w:rPr>
+              <w:t>Weekly supplier capacity review and collaboration</w:t>
+            </w:r>
+          </w:p>
+        </w:tc>
+      </w:tr>
+      <w:tr>
+        <w:tc>
+          <w:tcPr>
+            <w:tcW w:type="dxa" w:w="1368"/>
+          </w:tcPr>
+          <w:p>
+            <w:pPr>
+              <w:spacing w:line="240" w:lineRule="auto"/>
+              <w:ind w:firstLine="0"/>
+            </w:pPr>
+            <w:r/>
+            <w:r>
+              <w:rPr>
+                <w:b/>
+                <w:sz w:val="16"/>
+              </w:rPr>
+              <w:t>Fastener kit</w:t>
+            </w:r>
+          </w:p>
+        </w:tc>
+        <w:tc>
+          <w:tcPr>
+            <w:tcW w:type="dxa" w:w="576"/>
+          </w:tcPr>
+          <w:p>
+            <w:pPr>
+              <w:spacing w:line="240" w:lineRule="auto"/>
+              <w:ind w:firstLine="0"/>
+            </w:pPr>
+            <w:r/>
+            <w:r>
+              <w:rPr>
+                <w:b w:val="0"/>
+                <w:sz w:val="16"/>
+              </w:rPr>
+              <w:t>800</w:t>
+            </w:r>
+          </w:p>
+        </w:tc>
+        <w:tc>
+          <w:tcPr>
+            <w:tcW w:type="dxa" w:w="547"/>
+          </w:tcPr>
+          <w:p>
+            <w:pPr>
+              <w:spacing w:line="240" w:lineRule="auto"/>
+              <w:ind w:firstLine="0"/>
+            </w:pPr>
+            <w:r/>
+            <w:r>
+              <w:rPr>
+                <w:b w:val="0"/>
+                <w:sz w:val="16"/>
+              </w:rPr>
+              <w:t>600</w:t>
+            </w:r>
+          </w:p>
+        </w:tc>
+        <w:tc>
+          <w:tcPr>
+            <w:tcW w:type="dxa" w:w="547"/>
+          </w:tcPr>
+          <w:p>
+            <w:pPr>
+              <w:spacing w:line="240" w:lineRule="auto"/>
+              <w:ind w:firstLine="0"/>
+            </w:pPr>
+            <w:r/>
+            <w:r>
+              <w:rPr>
+                <w:b w:val="0"/>
+                <w:sz w:val="16"/>
+              </w:rPr>
+              <w:t>400</w:t>
+            </w:r>
+          </w:p>
+        </w:tc>
+        <w:tc>
+          <w:tcPr>
+            <w:tcW w:type="dxa" w:w="475"/>
+          </w:tcPr>
+          <w:p>
+            <w:pPr>
+              <w:spacing w:line="240" w:lineRule="auto"/>
+              <w:ind w:firstLine="0"/>
+            </w:pPr>
+            <w:r/>
+            <w:r>
+              <w:rPr>
+                <w:b w:val="0"/>
+                <w:sz w:val="16"/>
+              </w:rPr>
+              <w:t>50</w:t>
+            </w:r>
+          </w:p>
+        </w:tc>
+        <w:tc>
+          <w:tcPr>
+            <w:tcW w:type="dxa" w:w="403"/>
+          </w:tcPr>
+          <w:p>
+            <w:pPr>
+              <w:spacing w:line="240" w:lineRule="auto"/>
+              <w:ind w:firstLine="0"/>
+            </w:pPr>
+            <w:r/>
+            <w:r>
+              <w:rPr>
+                <w:b w:val="0"/>
+                <w:sz w:val="16"/>
+              </w:rPr>
+              <w:t>3</w:t>
+            </w:r>
+          </w:p>
+        </w:tc>
+        <w:tc>
+          <w:tcPr>
+            <w:tcW w:type="dxa" w:w="360"/>
+          </w:tcPr>
+          <w:p>
+            <w:pPr>
+              <w:spacing w:line="240" w:lineRule="auto"/>
+              <w:ind w:firstLine="0"/>
+            </w:pPr>
+            <w:r/>
+            <w:r>
+              <w:rPr>
+                <w:b w:val="0"/>
+                <w:sz w:val="16"/>
+              </w:rPr>
+              <w:t>4</w:t>
+            </w:r>
+          </w:p>
+        </w:tc>
+        <w:tc>
+          <w:tcPr>
+            <w:tcW w:type="dxa" w:w="547"/>
+          </w:tcPr>
+          <w:p>
+            <w:pPr>
+              <w:spacing w:line="240" w:lineRule="auto"/>
+              <w:ind w:firstLine="0"/>
+            </w:pPr>
+            <w:r/>
+            <w:r>
+              <w:rPr>
+                <w:b w:val="0"/>
+                <w:sz w:val="16"/>
+              </w:rPr>
+              <w:t>0.40</w:t>
+            </w:r>
+          </w:p>
+        </w:tc>
+        <w:tc>
+          <w:tcPr>
+            <w:tcW w:type="dxa" w:w="547"/>
+          </w:tcPr>
+          <w:p>
+            <w:pPr>
+              <w:spacing w:line="240" w:lineRule="auto"/>
+              <w:ind w:firstLine="0"/>
+            </w:pPr>
+            <w:r/>
+            <w:r>
+              <w:rPr>
+                <w:b w:val="0"/>
+                <w:sz w:val="16"/>
+              </w:rPr>
+              <w:t>1.18</w:t>
+            </w:r>
+          </w:p>
+        </w:tc>
+        <w:tc>
+          <w:tcPr>
+            <w:tcW w:type="dxa" w:w="518"/>
+          </w:tcPr>
+          <w:p>
+            <w:pPr>
+              <w:spacing w:line="240" w:lineRule="auto"/>
+              <w:ind w:firstLine="0"/>
+            </w:pPr>
+            <w:r/>
+            <w:r>
+              <w:rPr>
+                <w:b w:val="0"/>
+                <w:sz w:val="16"/>
+              </w:rPr>
+              <w:t>0</w:t>
+            </w:r>
+          </w:p>
+        </w:tc>
+        <w:tc>
+          <w:tcPr>
+            <w:tcW w:type="dxa" w:w="475"/>
+            <w:shd w:val="clear" w:color="auto" w:fill="C8EBC8"/>
+          </w:tcPr>
+          <w:p>
+            <w:pPr>
+              <w:spacing w:line="240" w:lineRule="auto"/>
+              <w:ind w:firstLine="0"/>
+            </w:pPr>
+            <w:r/>
+            <w:r>
+              <w:rPr>
+                <w:b w:val="0"/>
+                <w:sz w:val="16"/>
+              </w:rPr>
+              <w:t>19</w:t>
+            </w:r>
+          </w:p>
+        </w:tc>
+        <w:tc>
+          <w:tcPr>
+            <w:tcW w:type="dxa" w:w="950"/>
+            <w:shd w:val="clear" w:color="auto" w:fill="C8EBC8"/>
+          </w:tcPr>
+          <w:p>
+            <w:pPr>
+              <w:spacing w:line="240" w:lineRule="auto"/>
+              <w:ind w:firstLine="0"/>
+            </w:pPr>
+            <w:r/>
+            <w:r>
+              <w:rPr>
+                <w:b w:val="0"/>
+                <w:sz w:val="16"/>
+              </w:rPr>
+              <w:t>Good</w:t>
+            </w:r>
+          </w:p>
+        </w:tc>
+        <w:tc>
+          <w:tcPr>
+            <w:tcW w:type="dxa" w:w="2088"/>
+            <w:shd w:val="clear" w:color="auto" w:fill="C8EBC8"/>
+          </w:tcPr>
+          <w:p>
+            <w:pPr>
+              <w:spacing w:line="240" w:lineRule="auto"/>
+              <w:ind w:firstLine="0"/>
+            </w:pPr>
+            <w:r/>
+            <w:r>
+              <w:rPr>
+                <w:b w:val="0"/>
+                <w:sz w:val="16"/>
+              </w:rPr>
+              <w:t>Maintain lean / just-in-time replenishment</w:t>
+            </w:r>
+          </w:p>
+        </w:tc>
+      </w:tr>
+    </w:tbl>
+    <w:p>
+      <w:pPr>
+        <w:spacing w:line="480" w:lineRule="auto"/>
+      </w:pPr>
+      <w:r>
+        <w:rPr>
+          <w:i/>
+        </w:rPr>
+        <w:t xml:space="preserve">Note. </w:t>
+      </w:r>
+      <w:r>
+        <w:t>All values are hypothetical and were created only to demonstrate the calculation; they are not data from any firm or study. H = 13 weeks. D = ramp-up demand; I = on-hand; S = confirmed open supply; SS = safety stock; L = lead time in weeks; n = qualified sources; u = utilization; C = coverage; G = gap in units; R = risk score.</w:t>
+      </w:r>
+    </w:p>
+    <w:p>
+      <w:pPr>
+        <w:keepNext/>
+        <w:pageBreakBefore/>
+      </w:pPr>
+      <w:r>
+        <w:rPr>
+          <w:b/>
+          <w:i w:val="0"/>
+        </w:rPr>
+        <w:t>Figure A2</w:t>
+      </w:r>
+    </w:p>
+    <w:p>
+      <w:pPr>
+        <w:keepNext/>
+      </w:pPr>
+      <w:r>
+        <w:rPr>
+          <w:b w:val="0"/>
+          <w:i/>
+        </w:rPr>
+        <w:t>Illustrative Shortage Risk Scores by Part (Hypothetical Data)</w:t>
+      </w:r>
+    </w:p>
+    <w:p>
+      <w:pPr>
+        <w:keepNext/>
+        <w:spacing w:line="240" w:lineRule="auto"/>
+        <w:jc w:val="center"/>
+      </w:pPr>
+      <w:r>
+        <w:drawing>
+          <wp:inline xmlns:a="http://schemas.openxmlformats.org/drawingml/2006/main" xmlns:pic="http://schemas.openxmlformats.org/drawingml/2006/picture">
+            <wp:extent cx="5486400" cy="2691073"/>
+            <wp:docPr id="5" name="Picture 5"/>
+            <wp:cNvGraphicFramePr>
+              <a:graphicFrameLocks noChangeAspect="1"/>
+            </wp:cNvGraphicFramePr>
+            <a:graphic>
+              <a:graphicData uri="http://schemas.openxmlformats.org/drawingml/2006/picture">
+                <pic:pic>
+                  <pic:nvPicPr>
+                    <pic:cNvPr id="0" name="fig4_risk.png"/>
+                    <pic:cNvPicPr/>
+                  </pic:nvPicPr>
+                  <pic:blipFill>
+                    <a:blip r:embed="rId14"/>
+                    <a:stretch>
+                      <a:fillRect/>
+                    </a:stretch>
+                  </pic:blipFill>
+                  <pic:spPr>
+                    <a:xfrm>
+                      <a:off x="0" y="0"/>
+                      <a:ext cx="5486400" cy="2691073"/>
+                    </a:xfrm>
+                    <a:prstGeom prst="rect"/>
+                  </pic:spPr>
+                </pic:pic>
+              </a:graphicData>
+            </a:graphic>
+          </wp:inline>
+        </w:drawing>
+      </w:r>
+    </w:p>
+    <w:p>
+      <w:pPr>
+        <w:spacing w:line="480" w:lineRule="auto"/>
+      </w:pPr>
+      <w:r>
+        <w:rPr>
+          <w:i/>
+        </w:rPr>
+        <w:t xml:space="preserve">Note. </w:t>
+      </w:r>
+      <w:r>
+        <w:t>Dashed lines mark the status thresholds at 30, 50, and 70. Bars are colored by status (red = critical, coral = serious, amber = warning, green = good), and each bar is also labeled with its status so meaning does not depend on color alone. Values are computed from Table A1.</w:t>
       </w:r>
     </w:p>
     <w:sectPr>

</xml_diff>

<commit_message>
Move references list to the end of the paper
Co-Authored-By: Claude Opus 5.5 <noreply@anthropic.com>
Claude-Session: https://claude.ai/code/session_01XnYwi52cCfyVyiDXeuekrB
</commit_message>
<xml_diff>
--- a/Research_Lifecycle_Three_Dissertations.docx
+++ b/Research_Lifecycle_Three_Dissertations.docx
@@ -571,204 +571,6 @@
           <w:i w:val="0"/>
         </w:rPr>
         <w:t>For the proposed qualitative case study, Benton's (2019) design offers a model for interviews, document review, and thematic analysis with equipment providers and suppliers, while Ponomarov's (2012) constructs and Pettit's (2008) vulnerability-capability lens can structure the coding of shortages, lead times, and shifts in supplier-buyer power. The semiconductor context sharpens the ethical and legal concerns, because firms operate under strict nondisclosure agreements and equipment data may be subject to export controls. IRB approval, informed consent, de-identification of firms, and careful screening of proprietary documents will therefore be central to the proposed research.</w:t>
-      </w:r>
-    </w:p>
-    <w:p>
-      <w:pPr>
-        <w:keepNext/>
-        <w:pageBreakBefore/>
-        <w:jc w:val="center"/>
-      </w:pPr>
-      <w:r>
-        <w:rPr>
-          <w:b/>
-          <w:i w:val="0"/>
-        </w:rPr>
-        <w:t>References</w:t>
-      </w:r>
-    </w:p>
-    <w:p>
-      <w:pPr>
-        <w:ind w:left="720" w:hanging="720"/>
-      </w:pPr>
-      <w:r>
-        <w:rPr>
-          <w:i w:val="0"/>
-        </w:rPr>
-        <w:t xml:space="preserve">Asamoah, A., Enyan, N. I. E., Diji, A. K., &amp; Domfeh, C. (2021). Cold chain management by healthcare providers at a district in Ghana: A mixed methods study. </w:t>
-      </w:r>
-      <w:r>
-        <w:rPr>
-          <w:i/>
-        </w:rPr>
-        <w:t>BioMed Research International, 2021</w:t>
-      </w:r>
-      <w:r>
-        <w:rPr>
-          <w:i w:val="0"/>
-        </w:rPr>
-        <w:t>(1), 7559984. https://doi.org/10.1155/2021/7559984</w:t>
-      </w:r>
-    </w:p>
-    <w:p>
-      <w:pPr>
-        <w:ind w:left="720" w:hanging="720"/>
-      </w:pPr>
-      <w:r>
-        <w:rPr>
-          <w:i w:val="0"/>
-        </w:rPr>
-        <w:t xml:space="preserve">Benton, V. K. (2019). </w:t>
-      </w:r>
-      <w:r>
-        <w:rPr>
-          <w:i/>
-        </w:rPr>
-        <w:t>Manufacturing companies' strategies to mitigate supply chain disruptions</w:t>
-      </w:r>
-      <w:r>
-        <w:rPr>
-          <w:i w:val="0"/>
-        </w:rPr>
-        <w:t xml:space="preserve"> [Doctoral dissertation, Walden University]. Walden Dissertations and Doctoral Studies. https://scholarworks.waldenu.edu/dissertations/7855</w:t>
-      </w:r>
-    </w:p>
-    <w:p>
-      <w:pPr>
-        <w:ind w:left="720" w:hanging="720"/>
-      </w:pPr>
-      <w:r>
-        <w:rPr>
-          <w:i w:val="0"/>
-        </w:rPr>
-        <w:t xml:space="preserve">Bimha, H., Hoque, M., &amp; Munapo, E. (2019). The impact of supply chain management practices on industry competitiveness: A mixed-methods study on the Zimbabwean petroleum industry. </w:t>
-      </w:r>
-      <w:r>
-        <w:rPr>
-          <w:i/>
-        </w:rPr>
-        <w:t>African Journal of Science, Technology, Innovation and Development, 12</w:t>
-      </w:r>
-      <w:r>
-        <w:rPr>
-          <w:i w:val="0"/>
-        </w:rPr>
-        <w:t>(1), 97–109. https://doi.org/10.1080/20421338.2019.1613785</w:t>
-      </w:r>
-    </w:p>
-    <w:p>
-      <w:pPr>
-        <w:ind w:left="720" w:hanging="720"/>
-      </w:pPr>
-      <w:r>
-        <w:rPr>
-          <w:i w:val="0"/>
-        </w:rPr>
-        <w:t xml:space="preserve">Kouvelis, P., Chen, X., &amp; Xia, Y. (2023). Managing material shortages in project supply chains: Inventories, time buffers, and supplier flexibility. </w:t>
-      </w:r>
-      <w:r>
-        <w:rPr>
-          <w:i/>
-        </w:rPr>
-        <w:t>Production and Operations Management, 32</w:t>
-      </w:r>
-      <w:r>
-        <w:rPr>
-          <w:i w:val="0"/>
-        </w:rPr>
-        <w:t>(11), 3717–3735. https://doi.org/10.1111/poms.14059</w:t>
-      </w:r>
-    </w:p>
-    <w:p>
-      <w:pPr>
-        <w:ind w:left="720" w:hanging="720"/>
-      </w:pPr>
-      <w:r>
-        <w:rPr>
-          <w:i w:val="0"/>
-        </w:rPr>
-        <w:t xml:space="preserve">Namisango, E., Allsop, M. J., Powell, R. A., Friedrichsdorf, S. J., Luyirika, E. B., Kiyange, F., Mukooza, E., Ntege, C., Garanganga, E., Ginindza-Mdluli, M. N., Mwangi-Powell, F., Mondlane, L. J., &amp; Harding, R. (2017). Investigation of the practices, legislation, supply chain, and regulation of opioids for clinical pain management in Southern Africa: A multi-sectoral, cross-national, mixed methods study. </w:t>
-      </w:r>
-      <w:r>
-        <w:rPr>
-          <w:i/>
-        </w:rPr>
-        <w:t>Journal of Pain and Symptom Management, 55</w:t>
-      </w:r>
-      <w:r>
-        <w:rPr>
-          <w:i w:val="0"/>
-        </w:rPr>
-        <w:t>(3), 851–863. https://doi.org/10.1016/j.jpainsymman.2017.11.010</w:t>
-      </w:r>
-    </w:p>
-    <w:p>
-      <w:pPr>
-        <w:ind w:left="720" w:hanging="720"/>
-      </w:pPr>
-      <w:r>
-        <w:rPr>
-          <w:i w:val="0"/>
-        </w:rPr>
-        <w:t xml:space="preserve">Pettit, T. J. (2008). </w:t>
-      </w:r>
-      <w:r>
-        <w:rPr>
-          <w:i/>
-        </w:rPr>
-        <w:t>Supply chain resilience: Development of a conceptual framework, an assessment tool and an implementation process</w:t>
-      </w:r>
-      <w:r>
-        <w:rPr>
-          <w:i w:val="0"/>
-        </w:rPr>
-        <w:t xml:space="preserve"> [Doctoral dissertation, The Ohio State University]. OhioLINK Electronic Theses and Dissertations Center. http://rave.ohiolink.edu/etdc/view?acc_num=osu1221767659</w:t>
-      </w:r>
-    </w:p>
-    <w:p>
-      <w:pPr>
-        <w:ind w:left="720" w:hanging="720"/>
-      </w:pPr>
-      <w:r>
-        <w:rPr>
-          <w:i w:val="0"/>
-        </w:rPr>
-        <w:t xml:space="preserve">Ponomarov, S. (2012). </w:t>
-      </w:r>
-      <w:r>
-        <w:rPr>
-          <w:i/>
-        </w:rPr>
-        <w:t>Antecedents and consequences of supply chain resilience: A dynamic capabilities perspective</w:t>
-      </w:r>
-      <w:r>
-        <w:rPr>
-          <w:i w:val="0"/>
-        </w:rPr>
-        <w:t xml:space="preserve"> [Doctoral dissertation, University of Tennessee]. TRACE: Tennessee Research and Creative Exchange. https://trace.tennessee.edu/utk_graddiss/1338</w:t>
-      </w:r>
-    </w:p>
-    <w:p>
-      <w:pPr>
-        <w:ind w:left="720" w:hanging="720"/>
-      </w:pPr>
-      <w:r>
-        <w:rPr>
-          <w:i w:val="0"/>
-        </w:rPr>
-        <w:t xml:space="preserve">Singh, J., Jaggi, C. K., &amp; Singh, M. (2026). An integrated humanitarian supply chain optimization model incorporating shortage mechanism and realistic constraints. </w:t>
-      </w:r>
-      <w:r>
-        <w:rPr>
-          <w:i/>
-        </w:rPr>
-        <w:t>Process Integration and Optimization for Sustainability</w:t>
-      </w:r>
-      <w:r>
-        <w:rPr>
-          <w:i w:val="0"/>
-        </w:rPr>
-        <w:t>. https://doi.org/10.1007/s41660-026-00723-y</w:t>
       </w:r>
     </w:p>
     <w:p>
@@ -4243,6 +4045,204 @@
         <w:t>Dashed lines mark the status thresholds at 30, 50, and 70. Bars are colored by status (red = critical, coral = serious, amber = warning, green = good), and each bar is also labeled with its status so meaning does not depend on color alone. Values are computed from Table A1.</w:t>
       </w:r>
     </w:p>
+    <w:p>
+      <w:pPr>
+        <w:keepNext/>
+        <w:pageBreakBefore/>
+        <w:jc w:val="center"/>
+      </w:pPr>
+      <w:r>
+        <w:rPr>
+          <w:b/>
+          <w:i w:val="0"/>
+        </w:rPr>
+        <w:t>References</w:t>
+      </w:r>
+    </w:p>
+    <w:p>
+      <w:pPr>
+        <w:ind w:left="720" w:hanging="720"/>
+      </w:pPr>
+      <w:r>
+        <w:rPr>
+          <w:i w:val="0"/>
+        </w:rPr>
+        <w:t xml:space="preserve">Asamoah, A., Enyan, N. I. E., Diji, A. K., &amp; Domfeh, C. (2021). Cold chain management by healthcare providers at a district in Ghana: A mixed methods study. </w:t>
+      </w:r>
+      <w:r>
+        <w:rPr>
+          <w:i/>
+        </w:rPr>
+        <w:t>BioMed Research International, 2021</w:t>
+      </w:r>
+      <w:r>
+        <w:rPr>
+          <w:i w:val="0"/>
+        </w:rPr>
+        <w:t>(1), 7559984. https://doi.org/10.1155/2021/7559984</w:t>
+      </w:r>
+    </w:p>
+    <w:p>
+      <w:pPr>
+        <w:ind w:left="720" w:hanging="720"/>
+      </w:pPr>
+      <w:r>
+        <w:rPr>
+          <w:i w:val="0"/>
+        </w:rPr>
+        <w:t xml:space="preserve">Benton, V. K. (2019). </w:t>
+      </w:r>
+      <w:r>
+        <w:rPr>
+          <w:i/>
+        </w:rPr>
+        <w:t>Manufacturing companies' strategies to mitigate supply chain disruptions</w:t>
+      </w:r>
+      <w:r>
+        <w:rPr>
+          <w:i w:val="0"/>
+        </w:rPr>
+        <w:t xml:space="preserve"> [Doctoral dissertation, Walden University]. Walden Dissertations and Doctoral Studies. https://scholarworks.waldenu.edu/dissertations/7855</w:t>
+      </w:r>
+    </w:p>
+    <w:p>
+      <w:pPr>
+        <w:ind w:left="720" w:hanging="720"/>
+      </w:pPr>
+      <w:r>
+        <w:rPr>
+          <w:i w:val="0"/>
+        </w:rPr>
+        <w:t xml:space="preserve">Bimha, H., Hoque, M., &amp; Munapo, E. (2019). The impact of supply chain management practices on industry competitiveness: A mixed-methods study on the Zimbabwean petroleum industry. </w:t>
+      </w:r>
+      <w:r>
+        <w:rPr>
+          <w:i/>
+        </w:rPr>
+        <w:t>African Journal of Science, Technology, Innovation and Development, 12</w:t>
+      </w:r>
+      <w:r>
+        <w:rPr>
+          <w:i w:val="0"/>
+        </w:rPr>
+        <w:t>(1), 97–109. https://doi.org/10.1080/20421338.2019.1613785</w:t>
+      </w:r>
+    </w:p>
+    <w:p>
+      <w:pPr>
+        <w:ind w:left="720" w:hanging="720"/>
+      </w:pPr>
+      <w:r>
+        <w:rPr>
+          <w:i w:val="0"/>
+        </w:rPr>
+        <w:t xml:space="preserve">Kouvelis, P., Chen, X., &amp; Xia, Y. (2023). Managing material shortages in project supply chains: Inventories, time buffers, and supplier flexibility. </w:t>
+      </w:r>
+      <w:r>
+        <w:rPr>
+          <w:i/>
+        </w:rPr>
+        <w:t>Production and Operations Management, 32</w:t>
+      </w:r>
+      <w:r>
+        <w:rPr>
+          <w:i w:val="0"/>
+        </w:rPr>
+        <w:t>(11), 3717–3735. https://doi.org/10.1111/poms.14059</w:t>
+      </w:r>
+    </w:p>
+    <w:p>
+      <w:pPr>
+        <w:ind w:left="720" w:hanging="720"/>
+      </w:pPr>
+      <w:r>
+        <w:rPr>
+          <w:i w:val="0"/>
+        </w:rPr>
+        <w:t xml:space="preserve">Namisango, E., Allsop, M. J., Powell, R. A., Friedrichsdorf, S. J., Luyirika, E. B., Kiyange, F., Mukooza, E., Ntege, C., Garanganga, E., Ginindza-Mdluli, M. N., Mwangi-Powell, F., Mondlane, L. J., &amp; Harding, R. (2017). Investigation of the practices, legislation, supply chain, and regulation of opioids for clinical pain management in Southern Africa: A multi-sectoral, cross-national, mixed methods study. </w:t>
+      </w:r>
+      <w:r>
+        <w:rPr>
+          <w:i/>
+        </w:rPr>
+        <w:t>Journal of Pain and Symptom Management, 55</w:t>
+      </w:r>
+      <w:r>
+        <w:rPr>
+          <w:i w:val="0"/>
+        </w:rPr>
+        <w:t>(3), 851–863. https://doi.org/10.1016/j.jpainsymman.2017.11.010</w:t>
+      </w:r>
+    </w:p>
+    <w:p>
+      <w:pPr>
+        <w:ind w:left="720" w:hanging="720"/>
+      </w:pPr>
+      <w:r>
+        <w:rPr>
+          <w:i w:val="0"/>
+        </w:rPr>
+        <w:t xml:space="preserve">Pettit, T. J. (2008). </w:t>
+      </w:r>
+      <w:r>
+        <w:rPr>
+          <w:i/>
+        </w:rPr>
+        <w:t>Supply chain resilience: Development of a conceptual framework, an assessment tool and an implementation process</w:t>
+      </w:r>
+      <w:r>
+        <w:rPr>
+          <w:i w:val="0"/>
+        </w:rPr>
+        <w:t xml:space="preserve"> [Doctoral dissertation, The Ohio State University]. OhioLINK Electronic Theses and Dissertations Center. http://rave.ohiolink.edu/etdc/view?acc_num=osu1221767659</w:t>
+      </w:r>
+    </w:p>
+    <w:p>
+      <w:pPr>
+        <w:ind w:left="720" w:hanging="720"/>
+      </w:pPr>
+      <w:r>
+        <w:rPr>
+          <w:i w:val="0"/>
+        </w:rPr>
+        <w:t xml:space="preserve">Ponomarov, S. (2012). </w:t>
+      </w:r>
+      <w:r>
+        <w:rPr>
+          <w:i/>
+        </w:rPr>
+        <w:t>Antecedents and consequences of supply chain resilience: A dynamic capabilities perspective</w:t>
+      </w:r>
+      <w:r>
+        <w:rPr>
+          <w:i w:val="0"/>
+        </w:rPr>
+        <w:t xml:space="preserve"> [Doctoral dissertation, University of Tennessee]. TRACE: Tennessee Research and Creative Exchange. https://trace.tennessee.edu/utk_graddiss/1338</w:t>
+      </w:r>
+    </w:p>
+    <w:p>
+      <w:pPr>
+        <w:ind w:left="720" w:hanging="720"/>
+      </w:pPr>
+      <w:r>
+        <w:rPr>
+          <w:i w:val="0"/>
+        </w:rPr>
+        <w:t xml:space="preserve">Singh, J., Jaggi, C. K., &amp; Singh, M. (2026). An integrated humanitarian supply chain optimization model incorporating shortage mechanism and realistic constraints. </w:t>
+      </w:r>
+      <w:r>
+        <w:rPr>
+          <w:i/>
+        </w:rPr>
+        <w:t>Process Integration and Optimization for Sustainability</w:t>
+      </w:r>
+      <w:r>
+        <w:rPr>
+          <w:i w:val="0"/>
+        </w:rPr>
+        <w:t>. https://doi.org/10.1007/s41660-026-00723-y</w:t>
+      </w:r>
+    </w:p>
     <w:sectPr>
       <w:headerReference w:type="default" r:id="rId9"/>
       <w:pgSz w:w="12240" w:h="15840"/>

</xml_diff>